<commit_message>
adding graphs to the report
</commit_message>
<xml_diff>
--- a/reports/ProjectReport_20230541_20230085_20231042_20230317_20230272.docx
+++ b/reports/ProjectReport_20230541_20230085_20231042_20230317_20230272.docx
@@ -473,27 +473,7 @@
                 <w:szCs w:val="28"/>
                 <w:lang w:bidi="ar-EG"/>
               </w:rPr>
-              <w:t xml:space="preserve">Basel </w:t>
-            </w:r>
-            <w:r>
-              <w:rPr>
-                <w:b/>
-                <w:bCs/>
-                <w:sz w:val="28"/>
-                <w:szCs w:val="28"/>
-                <w:lang w:bidi="ar-EG"/>
-              </w:rPr>
-              <w:t>M</w:t>
-            </w:r>
-            <w:r>
-              <w:rPr>
-                <w:b/>
-                <w:bCs/>
-                <w:sz w:val="28"/>
-                <w:szCs w:val="28"/>
-                <w:lang w:bidi="ar-EG"/>
-              </w:rPr>
-              <w:t>ohamed</w:t>
+              <w:t>Basel Mohamed</w:t>
             </w:r>
           </w:p>
         </w:tc>
@@ -551,27 +531,7 @@
                 <w:szCs w:val="28"/>
                 <w:lang w:bidi="ar-EG"/>
               </w:rPr>
-              <w:t xml:space="preserve">Mohamed </w:t>
-            </w:r>
-            <w:r>
-              <w:rPr>
-                <w:b/>
-                <w:bCs/>
-                <w:sz w:val="28"/>
-                <w:szCs w:val="28"/>
-                <w:lang w:bidi="ar-EG"/>
-              </w:rPr>
-              <w:t>E</w:t>
-            </w:r>
-            <w:r>
-              <w:rPr>
-                <w:b/>
-                <w:bCs/>
-                <w:sz w:val="28"/>
-                <w:szCs w:val="28"/>
-                <w:lang w:bidi="ar-EG"/>
-              </w:rPr>
-              <w:t>lkady</w:t>
+              <w:t>Mohamed Elkady</w:t>
             </w:r>
           </w:p>
         </w:tc>
@@ -745,27 +705,7 @@
                 <w:szCs w:val="28"/>
                 <w:lang w:bidi="ar-EG"/>
               </w:rPr>
-              <w:t xml:space="preserve">Amr </w:t>
-            </w:r>
-            <w:r>
-              <w:rPr>
-                <w:b/>
-                <w:bCs/>
-                <w:sz w:val="28"/>
-                <w:szCs w:val="28"/>
-                <w:lang w:bidi="ar-EG"/>
-              </w:rPr>
-              <w:t>K</w:t>
-            </w:r>
-            <w:r>
-              <w:rPr>
-                <w:b/>
-                <w:bCs/>
-                <w:sz w:val="28"/>
-                <w:szCs w:val="28"/>
-                <w:lang w:bidi="ar-EG"/>
-              </w:rPr>
-              <w:t>halid</w:t>
+              <w:t>Amr Khalid</w:t>
             </w:r>
           </w:p>
         </w:tc>
@@ -1180,6 +1120,7 @@
         <w:rPr>
           <w:lang w:bidi="ar-EG"/>
         </w:rPr>
+        <w:lastRenderedPageBreak/>
         <w:t>Phase 1: Classical Machine Learning &amp; Pipeline Engineering</w:t>
       </w:r>
     </w:p>
@@ -1306,6 +1247,170 @@
       <w:pPr>
         <w:ind w:left="720"/>
         <w:rPr>
+          <w:b/>
+          <w:bCs/>
+          <w:sz w:val="28"/>
+          <w:szCs w:val="28"/>
+          <w:lang w:bidi="ar-EG"/>
+        </w:rPr>
+      </w:pPr>
+      <w:r>
+        <w:rPr>
+          <w:b/>
+          <w:bCs/>
+          <w:sz w:val="28"/>
+          <w:szCs w:val="28"/>
+          <w:lang w:bidi="ar-EG"/>
+        </w:rPr>
+        <w:drawing>
+          <wp:inline distT="0" distB="0" distL="0" distR="0" wp14:anchorId="51684E4B" wp14:editId="4B72E511">
+            <wp:extent cx="5644900" cy="2004060"/>
+            <wp:effectExtent l="0" t="0" r="0" b="0"/>
+            <wp:docPr id="1503711495" name="Picture 1"/>
+            <wp:cNvGraphicFramePr>
+              <a:graphicFrameLocks xmlns:a="http://schemas.openxmlformats.org/drawingml/2006/main" noChangeAspect="1"/>
+            </wp:cNvGraphicFramePr>
+            <a:graphic xmlns:a="http://schemas.openxmlformats.org/drawingml/2006/main">
+              <a:graphicData uri="http://schemas.openxmlformats.org/drawingml/2006/picture">
+                <pic:pic xmlns:pic="http://schemas.openxmlformats.org/drawingml/2006/picture">
+                  <pic:nvPicPr>
+                    <pic:cNvPr id="1503711495" name=""/>
+                    <pic:cNvPicPr/>
+                  </pic:nvPicPr>
+                  <pic:blipFill>
+                    <a:blip r:embed="rId8"/>
+                    <a:stretch>
+                      <a:fillRect/>
+                    </a:stretch>
+                  </pic:blipFill>
+                  <pic:spPr>
+                    <a:xfrm>
+                      <a:off x="0" y="0"/>
+                      <a:ext cx="5647568" cy="2005007"/>
+                    </a:xfrm>
+                    <a:prstGeom prst="rect">
+                      <a:avLst/>
+                    </a:prstGeom>
+                  </pic:spPr>
+                </pic:pic>
+              </a:graphicData>
+            </a:graphic>
+          </wp:inline>
+        </w:drawing>
+      </w:r>
+    </w:p>
+    <w:p>
+      <w:pPr>
+        <w:ind w:left="720"/>
+        <w:rPr>
+          <w:b/>
+          <w:bCs/>
+          <w:sz w:val="28"/>
+          <w:szCs w:val="28"/>
+          <w:lang w:bidi="ar-EG"/>
+        </w:rPr>
+      </w:pPr>
+    </w:p>
+    <w:p>
+      <w:pPr>
+        <w:ind w:left="720"/>
+        <w:rPr>
+          <w:b/>
+          <w:bCs/>
+          <w:sz w:val="28"/>
+          <w:szCs w:val="28"/>
+          <w:lang w:bidi="ar-EG"/>
+        </w:rPr>
+      </w:pPr>
+    </w:p>
+    <w:p>
+      <w:pPr>
+        <w:ind w:left="720"/>
+        <w:rPr>
+          <w:b/>
+          <w:bCs/>
+          <w:sz w:val="28"/>
+          <w:szCs w:val="28"/>
+          <w:lang w:bidi="ar-EG"/>
+        </w:rPr>
+      </w:pPr>
+    </w:p>
+    <w:p>
+      <w:pPr>
+        <w:ind w:left="720"/>
+        <w:rPr>
+          <w:b/>
+          <w:bCs/>
+          <w:sz w:val="28"/>
+          <w:szCs w:val="28"/>
+          <w:lang w:bidi="ar-EG"/>
+        </w:rPr>
+      </w:pPr>
+    </w:p>
+    <w:p>
+      <w:pPr>
+        <w:ind w:left="720"/>
+        <w:rPr>
+          <w:b/>
+          <w:bCs/>
+          <w:sz w:val="28"/>
+          <w:szCs w:val="28"/>
+          <w:lang w:bidi="ar-EG"/>
+        </w:rPr>
+      </w:pPr>
+    </w:p>
+    <w:p>
+      <w:pPr>
+        <w:ind w:left="720"/>
+        <w:rPr>
+          <w:b/>
+          <w:bCs/>
+          <w:sz w:val="28"/>
+          <w:szCs w:val="28"/>
+          <w:lang w:bidi="ar-EG"/>
+        </w:rPr>
+      </w:pPr>
+    </w:p>
+    <w:p>
+      <w:pPr>
+        <w:ind w:left="720"/>
+        <w:rPr>
+          <w:b/>
+          <w:bCs/>
+          <w:sz w:val="28"/>
+          <w:szCs w:val="28"/>
+          <w:lang w:bidi="ar-EG"/>
+        </w:rPr>
+      </w:pPr>
+    </w:p>
+    <w:p>
+      <w:pPr>
+        <w:ind w:left="720"/>
+        <w:rPr>
+          <w:b/>
+          <w:bCs/>
+          <w:sz w:val="28"/>
+          <w:szCs w:val="28"/>
+          <w:lang w:bidi="ar-EG"/>
+        </w:rPr>
+      </w:pPr>
+    </w:p>
+    <w:p>
+      <w:pPr>
+        <w:ind w:left="720"/>
+        <w:rPr>
+          <w:b/>
+          <w:bCs/>
+          <w:sz w:val="28"/>
+          <w:szCs w:val="28"/>
+          <w:lang w:bidi="ar-EG"/>
+        </w:rPr>
+      </w:pPr>
+    </w:p>
+    <w:p>
+      <w:pPr>
+        <w:ind w:left="720"/>
+        <w:rPr>
           <w:sz w:val="28"/>
           <w:szCs w:val="28"/>
           <w:lang w:bidi="ar-EG"/>
@@ -1339,6 +1444,66 @@
         </w:rPr>
         <w:t>Randomly sampling and visualizing images from each class allowed for a qualitative assessment of intra-class variance. To handle variations in lighting, preliminary dimensionality reduction experiments were conducted using Principal Component Analysis (PCA). PCA helped visualize the dataset's variance in 2D and 3D space, revealing that raw pixel data alone contains too much overlapping noise to be linearly separable, thus motivating the need for robust feature engineering.</w:t>
       </w:r>
+      <w:r>
+        <w:rPr>
+          <w:sz w:val="28"/>
+          <w:szCs w:val="28"/>
+          <w:lang w:bidi="ar-EG"/>
+        </w:rPr>
+        <w:br/>
+      </w:r>
+    </w:p>
+    <w:p>
+      <w:pPr>
+        <w:ind w:left="720"/>
+        <w:rPr>
+          <w:sz w:val="28"/>
+          <w:szCs w:val="28"/>
+          <w:lang w:bidi="ar-EG"/>
+        </w:rPr>
+      </w:pPr>
+      <w:r>
+        <w:rPr>
+          <w:sz w:val="28"/>
+          <w:szCs w:val="28"/>
+          <w:lang w:bidi="ar-EG"/>
+        </w:rPr>
+        <w:drawing>
+          <wp:inline distT="0" distB="0" distL="0" distR="0" wp14:anchorId="0319DF0D" wp14:editId="1BAD245B">
+            <wp:extent cx="4872113" cy="2945130"/>
+            <wp:effectExtent l="0" t="0" r="5080" b="7620"/>
+            <wp:docPr id="1471324123" name="Picture 1"/>
+            <wp:cNvGraphicFramePr>
+              <a:graphicFrameLocks xmlns:a="http://schemas.openxmlformats.org/drawingml/2006/main" noChangeAspect="1"/>
+            </wp:cNvGraphicFramePr>
+            <a:graphic xmlns:a="http://schemas.openxmlformats.org/drawingml/2006/main">
+              <a:graphicData uri="http://schemas.openxmlformats.org/drawingml/2006/picture">
+                <pic:pic xmlns:pic="http://schemas.openxmlformats.org/drawingml/2006/picture">
+                  <pic:nvPicPr>
+                    <pic:cNvPr id="1471324123" name=""/>
+                    <pic:cNvPicPr/>
+                  </pic:nvPicPr>
+                  <pic:blipFill>
+                    <a:blip r:embed="rId9"/>
+                    <a:stretch>
+                      <a:fillRect/>
+                    </a:stretch>
+                  </pic:blipFill>
+                  <pic:spPr>
+                    <a:xfrm>
+                      <a:off x="0" y="0"/>
+                      <a:ext cx="4885365" cy="2953141"/>
+                    </a:xfrm>
+                    <a:prstGeom prst="rect">
+                      <a:avLst/>
+                    </a:prstGeom>
+                  </pic:spPr>
+                </pic:pic>
+              </a:graphicData>
+            </a:graphic>
+          </wp:inline>
+        </w:drawing>
+      </w:r>
     </w:p>
     <w:p>
       <w:pPr>
@@ -1349,12 +1514,44 @@
           <w:lang w:bidi="ar-EG"/>
         </w:rPr>
       </w:pPr>
-      <w:r>
-        <w:rPr>
-          <w:b/>
-          <w:bCs/>
-          <w:lang w:bidi="ar-EG"/>
-        </w:rPr>
+    </w:p>
+    <w:p>
+      <w:pPr>
+        <w:rPr>
+          <w:lang w:bidi="ar-EG"/>
+        </w:rPr>
+      </w:pPr>
+    </w:p>
+    <w:p>
+      <w:pPr>
+        <w:rPr>
+          <w:lang w:bidi="ar-EG"/>
+        </w:rPr>
+      </w:pPr>
+    </w:p>
+    <w:p>
+      <w:pPr>
+        <w:rPr>
+          <w:lang w:bidi="ar-EG"/>
+        </w:rPr>
+      </w:pPr>
+    </w:p>
+    <w:p>
+      <w:pPr>
+        <w:pStyle w:val="Heading2"/>
+        <w:rPr>
+          <w:b/>
+          <w:bCs/>
+          <w:lang w:bidi="ar-EG"/>
+        </w:rPr>
+      </w:pPr>
+      <w:r>
+        <w:rPr>
+          <w:b/>
+          <w:bCs/>
+          <w:lang w:bidi="ar-EG"/>
+        </w:rPr>
+        <w:lastRenderedPageBreak/>
         <w:t>3.2 Feature Extraction System (feature_extraction.py)</w:t>
       </w:r>
     </w:p>
@@ -1463,6 +1660,78 @@
     </w:p>
     <w:p>
       <w:pPr>
+        <w:rPr>
+          <w:b/>
+          <w:bCs/>
+          <w:sz w:val="36"/>
+          <w:szCs w:val="28"/>
+          <w:lang w:bidi="ar-EG"/>
+        </w:rPr>
+      </w:pPr>
+      <w:r>
+        <w:rPr>
+          <w:b/>
+          <w:bCs/>
+          <w:sz w:val="36"/>
+          <w:szCs w:val="28"/>
+          <w:lang w:bidi="ar-EG"/>
+        </w:rPr>
+        <w:t>Hog Features:</w:t>
+      </w:r>
+    </w:p>
+    <w:p>
+      <w:pPr>
+        <w:rPr>
+          <w:sz w:val="28"/>
+          <w:szCs w:val="28"/>
+          <w:lang w:bidi="ar-EG"/>
+        </w:rPr>
+      </w:pPr>
+      <w:r>
+        <w:rPr>
+          <w:sz w:val="28"/>
+          <w:szCs w:val="28"/>
+          <w:lang w:bidi="ar-EG"/>
+        </w:rPr>
+        <w:drawing>
+          <wp:inline distT="0" distB="0" distL="0" distR="0" wp14:anchorId="67BD13D1" wp14:editId="5944FCF0">
+            <wp:extent cx="5962469" cy="2407920"/>
+            <wp:effectExtent l="0" t="0" r="635" b="0"/>
+            <wp:docPr id="1010465506" name="Picture 1"/>
+            <wp:cNvGraphicFramePr>
+              <a:graphicFrameLocks xmlns:a="http://schemas.openxmlformats.org/drawingml/2006/main" noChangeAspect="1"/>
+            </wp:cNvGraphicFramePr>
+            <a:graphic xmlns:a="http://schemas.openxmlformats.org/drawingml/2006/main">
+              <a:graphicData uri="http://schemas.openxmlformats.org/drawingml/2006/picture">
+                <pic:pic xmlns:pic="http://schemas.openxmlformats.org/drawingml/2006/picture">
+                  <pic:nvPicPr>
+                    <pic:cNvPr id="1010465506" name=""/>
+                    <pic:cNvPicPr/>
+                  </pic:nvPicPr>
+                  <pic:blipFill>
+                    <a:blip r:embed="rId10"/>
+                    <a:stretch>
+                      <a:fillRect/>
+                    </a:stretch>
+                  </pic:blipFill>
+                  <pic:spPr>
+                    <a:xfrm>
+                      <a:off x="0" y="0"/>
+                      <a:ext cx="5967026" cy="2409760"/>
+                    </a:xfrm>
+                    <a:prstGeom prst="rect">
+                      <a:avLst/>
+                    </a:prstGeom>
+                  </pic:spPr>
+                </pic:pic>
+              </a:graphicData>
+            </a:graphic>
+          </wp:inline>
+        </w:drawing>
+      </w:r>
+    </w:p>
+    <w:p>
+      <w:pPr>
         <w:pStyle w:val="Heading2"/>
         <w:rPr>
           <w:b/>
@@ -1470,12 +1739,90 @@
           <w:lang w:bidi="ar-EG"/>
         </w:rPr>
       </w:pPr>
-      <w:r>
-        <w:rPr>
-          <w:b/>
-          <w:bCs/>
-          <w:lang w:bidi="ar-EG"/>
-        </w:rPr>
+    </w:p>
+    <w:p>
+      <w:pPr>
+        <w:pStyle w:val="Heading2"/>
+        <w:rPr>
+          <w:b/>
+          <w:bCs/>
+          <w:lang w:bidi="ar-EG"/>
+        </w:rPr>
+      </w:pPr>
+    </w:p>
+    <w:p>
+      <w:pPr>
+        <w:pStyle w:val="Heading2"/>
+        <w:rPr>
+          <w:b/>
+          <w:bCs/>
+          <w:lang w:bidi="ar-EG"/>
+        </w:rPr>
+      </w:pPr>
+    </w:p>
+    <w:p>
+      <w:pPr>
+        <w:pStyle w:val="Heading2"/>
+        <w:rPr>
+          <w:b/>
+          <w:bCs/>
+          <w:lang w:bidi="ar-EG"/>
+        </w:rPr>
+      </w:pPr>
+    </w:p>
+    <w:p>
+      <w:pPr>
+        <w:pStyle w:val="Heading2"/>
+        <w:rPr>
+          <w:b/>
+          <w:bCs/>
+          <w:lang w:bidi="ar-EG"/>
+        </w:rPr>
+      </w:pPr>
+    </w:p>
+    <w:p>
+      <w:pPr>
+        <w:pStyle w:val="Heading2"/>
+        <w:rPr>
+          <w:b/>
+          <w:bCs/>
+          <w:lang w:bidi="ar-EG"/>
+        </w:rPr>
+      </w:pPr>
+    </w:p>
+    <w:p>
+      <w:pPr>
+        <w:pStyle w:val="Heading2"/>
+        <w:rPr>
+          <w:b/>
+          <w:bCs/>
+          <w:lang w:bidi="ar-EG"/>
+        </w:rPr>
+      </w:pPr>
+    </w:p>
+    <w:p>
+      <w:pPr>
+        <w:rPr>
+          <w:lang w:bidi="ar-EG"/>
+        </w:rPr>
+      </w:pPr>
+    </w:p>
+    <w:p>
+      <w:pPr>
+        <w:pStyle w:val="Heading2"/>
+        <w:rPr>
+          <w:b/>
+          <w:bCs/>
+          <w:lang w:bidi="ar-EG"/>
+        </w:rPr>
+      </w:pPr>
+      <w:r>
+        <w:rPr>
+          <w:b/>
+          <w:bCs/>
+          <w:lang w:bidi="ar-EG"/>
+        </w:rPr>
+        <w:lastRenderedPageBreak/>
         <w:t>3.3 Baseline Model Architecture (baselines.py &amp; pipeline_example.py)</w:t>
       </w:r>
     </w:p>
@@ -1881,6 +2228,89 @@
     </w:p>
     <w:p>
       <w:pPr>
+        <w:ind w:left="720"/>
+        <w:rPr>
+          <w:sz w:val="28"/>
+          <w:szCs w:val="28"/>
+          <w:lang w:bidi="ar-EG"/>
+        </w:rPr>
+      </w:pPr>
+      <w:r>
+        <w:rPr>
+          <w:b/>
+          <w:bCs/>
+          <w:sz w:val="28"/>
+          <w:szCs w:val="28"/>
+          <w:lang w:bidi="ar-EG"/>
+        </w:rPr>
+        <w:t>Base KNN and NB results</w:t>
+      </w:r>
+      <w:r>
+        <w:rPr>
+          <w:b/>
+          <w:bCs/>
+          <w:sz w:val="28"/>
+          <w:szCs w:val="28"/>
+          <w:lang w:bidi="ar-EG"/>
+        </w:rPr>
+        <w:t>:</w:t>
+      </w:r>
+    </w:p>
+    <w:p>
+      <w:pPr>
+        <w:ind w:left="720"/>
+        <w:rPr>
+          <w:sz w:val="28"/>
+          <w:szCs w:val="28"/>
+          <w:lang w:bidi="ar-EG"/>
+        </w:rPr>
+      </w:pPr>
+      <w:r>
+        <w:rPr>
+          <w:sz w:val="28"/>
+          <w:szCs w:val="28"/>
+          <w:lang w:bidi="ar-EG"/>
+        </w:rPr>
+        <w:lastRenderedPageBreak/>
+        <w:drawing>
+          <wp:inline distT="0" distB="0" distL="0" distR="0" wp14:anchorId="0261AFF2" wp14:editId="1501ECAA">
+            <wp:extent cx="5943600" cy="3490595"/>
+            <wp:effectExtent l="0" t="0" r="0" b="0"/>
+            <wp:docPr id="114702707" name="Picture 1"/>
+            <wp:cNvGraphicFramePr>
+              <a:graphicFrameLocks xmlns:a="http://schemas.openxmlformats.org/drawingml/2006/main" noChangeAspect="1"/>
+            </wp:cNvGraphicFramePr>
+            <a:graphic xmlns:a="http://schemas.openxmlformats.org/drawingml/2006/main">
+              <a:graphicData uri="http://schemas.openxmlformats.org/drawingml/2006/picture">
+                <pic:pic xmlns:pic="http://schemas.openxmlformats.org/drawingml/2006/picture">
+                  <pic:nvPicPr>
+                    <pic:cNvPr id="114702707" name=""/>
+                    <pic:cNvPicPr/>
+                  </pic:nvPicPr>
+                  <pic:blipFill>
+                    <a:blip r:embed="rId11"/>
+                    <a:stretch>
+                      <a:fillRect/>
+                    </a:stretch>
+                  </pic:blipFill>
+                  <pic:spPr>
+                    <a:xfrm>
+                      <a:off x="0" y="0"/>
+                      <a:ext cx="5943600" cy="3490595"/>
+                    </a:xfrm>
+                    <a:prstGeom prst="rect">
+                      <a:avLst/>
+                    </a:prstGeom>
+                  </pic:spPr>
+                </pic:pic>
+              </a:graphicData>
+            </a:graphic>
+          </wp:inline>
+        </w:drawing>
+      </w:r>
+    </w:p>
+    <w:p>
+      <w:pPr>
         <w:pStyle w:val="Heading2"/>
         <w:rPr>
           <w:b/>
@@ -1888,13 +2318,1120 @@
           <w:lang w:bidi="ar-EG"/>
         </w:rPr>
       </w:pPr>
-      <w:r>
-        <w:rPr>
-          <w:b/>
-          <w:bCs/>
-          <w:lang w:bidi="ar-EG"/>
-        </w:rPr>
-        <w:t>3.4 Hyperparameter Optimization (grid_search.py)</w:t>
+    </w:p>
+    <w:p>
+      <w:pPr>
+        <w:rPr>
+          <w:lang w:bidi="ar-EG"/>
+        </w:rPr>
+      </w:pPr>
+    </w:p>
+    <w:p>
+      <w:pPr>
+        <w:rPr>
+          <w:lang w:bidi="ar-EG"/>
+        </w:rPr>
+      </w:pPr>
+    </w:p>
+    <w:p>
+      <w:pPr>
+        <w:rPr>
+          <w:lang w:bidi="ar-EG"/>
+        </w:rPr>
+      </w:pPr>
+    </w:p>
+    <w:p>
+      <w:pPr>
+        <w:rPr>
+          <w:lang w:bidi="ar-EG"/>
+        </w:rPr>
+      </w:pPr>
+    </w:p>
+    <w:p>
+      <w:pPr>
+        <w:rPr>
+          <w:lang w:bidi="ar-EG"/>
+        </w:rPr>
+      </w:pPr>
+    </w:p>
+    <w:p>
+      <w:pPr>
+        <w:rPr>
+          <w:lang w:bidi="ar-EG"/>
+        </w:rPr>
+      </w:pPr>
+    </w:p>
+    <w:p>
+      <w:pPr>
+        <w:rPr>
+          <w:lang w:bidi="ar-EG"/>
+        </w:rPr>
+      </w:pPr>
+    </w:p>
+    <w:p>
+      <w:pPr>
+        <w:rPr>
+          <w:lang w:bidi="ar-EG"/>
+        </w:rPr>
+      </w:pPr>
+    </w:p>
+    <w:p>
+      <w:pPr>
+        <w:rPr>
+          <w:lang w:bidi="ar-EG"/>
+        </w:rPr>
+      </w:pPr>
+    </w:p>
+    <w:p>
+      <w:pPr>
+        <w:rPr>
+          <w:lang w:bidi="ar-EG"/>
+        </w:rPr>
+      </w:pPr>
+    </w:p>
+    <w:p>
+      <w:pPr>
+        <w:rPr>
+          <w:lang w:bidi="ar-EG"/>
+        </w:rPr>
+      </w:pPr>
+    </w:p>
+    <w:p>
+      <w:pPr>
+        <w:rPr>
+          <w:lang w:bidi="ar-EG"/>
+        </w:rPr>
+      </w:pPr>
+    </w:p>
+    <w:p>
+      <w:pPr>
+        <w:rPr>
+          <w:lang w:bidi="ar-EG"/>
+        </w:rPr>
+      </w:pPr>
+    </w:p>
+    <w:p>
+      <w:pPr>
+        <w:rPr>
+          <w:lang w:bidi="ar-EG"/>
+        </w:rPr>
+      </w:pPr>
+    </w:p>
+    <w:p>
+      <w:pPr>
+        <w:rPr>
+          <w:lang w:bidi="ar-EG"/>
+        </w:rPr>
+      </w:pPr>
+    </w:p>
+    <w:p>
+      <w:pPr>
+        <w:rPr>
+          <w:lang w:bidi="ar-EG"/>
+        </w:rPr>
+      </w:pPr>
+    </w:p>
+    <w:p>
+      <w:pPr>
+        <w:pStyle w:val="Heading2"/>
+        <w:rPr>
+          <w:b/>
+          <w:bCs/>
+          <w:lang w:bidi="ar-EG"/>
+        </w:rPr>
+      </w:pPr>
+      <w:r>
+        <w:rPr>
+          <w:b/>
+          <w:bCs/>
+          <w:lang w:bidi="ar-EG"/>
+        </w:rPr>
+        <w:lastRenderedPageBreak/>
+        <w:t>3.4</w:t>
+      </w:r>
+      <w:r>
+        <w:rPr>
+          <w:b/>
+          <w:bCs/>
+          <w:lang w:bidi="ar-EG"/>
+        </w:rPr>
+        <w:t xml:space="preserve"> </w:t>
+      </w:r>
+      <w:r>
+        <w:rPr>
+          <w:b/>
+          <w:bCs/>
+          <w:lang w:bidi="ar-EG"/>
+        </w:rPr>
+        <w:t>Dimensionality Reduction via PCA</w:t>
+      </w:r>
+    </w:p>
+    <w:p>
+      <w:pPr>
+        <w:rPr>
+          <w:sz w:val="28"/>
+          <w:lang w:bidi="ar-EG"/>
+        </w:rPr>
+      </w:pPr>
+      <w:r>
+        <w:rPr>
+          <w:sz w:val="28"/>
+          <w:lang w:bidi="ar-EG"/>
+        </w:rPr>
+        <w:t>To reduce the high dimensionality of the raw pixel data (3,072 features), we applied Principal Component Analysis (PCA). The goal was to minimize features while retaining maximum variance.</w:t>
+      </w:r>
+    </w:p>
+    <w:p>
+      <w:pPr>
+        <w:rPr>
+          <w:sz w:val="28"/>
+          <w:lang w:bidi="ar-EG"/>
+        </w:rPr>
+      </w:pPr>
+    </w:p>
+    <w:p>
+      <w:pPr>
+        <w:rPr>
+          <w:sz w:val="28"/>
+          <w:lang w:bidi="ar-EG"/>
+        </w:rPr>
+      </w:pPr>
+      <w:r>
+        <w:rPr>
+          <w:b/>
+          <w:bCs/>
+          <w:sz w:val="28"/>
+          <w:lang w:bidi="ar-EG"/>
+        </w:rPr>
+        <w:t>Analysis:</w:t>
+      </w:r>
+      <w:r>
+        <w:rPr>
+          <w:sz w:val="28"/>
+          <w:lang w:bidi="ar-EG"/>
+        </w:rPr>
+        <w:t xml:space="preserve"> </w:t>
+      </w:r>
+    </w:p>
+    <w:p>
+      <w:pPr>
+        <w:rPr>
+          <w:sz w:val="28"/>
+          <w:lang w:bidi="ar-EG"/>
+        </w:rPr>
+      </w:pPr>
+      <w:r>
+        <w:rPr>
+          <w:sz w:val="28"/>
+          <w:lang w:bidi="ar-EG"/>
+        </w:rPr>
+        <w:t>As shown in</w:t>
+      </w:r>
+      <w:r>
+        <w:rPr>
+          <w:sz w:val="28"/>
+          <w:lang w:bidi="ar-EG"/>
+        </w:rPr>
+        <w:t>:</w:t>
+      </w:r>
+      <w:r>
+        <w:rPr>
+          <w:sz w:val="28"/>
+          <w:lang w:bidi="ar-EG"/>
+        </w:rPr>
+        <w:br/>
+      </w:r>
+      <w:r>
+        <w:rPr>
+          <w:lang w:bidi="ar-EG"/>
+        </w:rPr>
+        <w:drawing>
+          <wp:inline distT="0" distB="0" distL="0" distR="0" wp14:anchorId="1A609ACE" wp14:editId="071F8F8E">
+            <wp:extent cx="4135755" cy="3151051"/>
+            <wp:effectExtent l="0" t="0" r="0" b="0"/>
+            <wp:docPr id="1824307003" name="Picture 1"/>
+            <wp:cNvGraphicFramePr>
+              <a:graphicFrameLocks xmlns:a="http://schemas.openxmlformats.org/drawingml/2006/main" noChangeAspect="1"/>
+            </wp:cNvGraphicFramePr>
+            <a:graphic xmlns:a="http://schemas.openxmlformats.org/drawingml/2006/main">
+              <a:graphicData uri="http://schemas.openxmlformats.org/drawingml/2006/picture">
+                <pic:pic xmlns:pic="http://schemas.openxmlformats.org/drawingml/2006/picture">
+                  <pic:nvPicPr>
+                    <pic:cNvPr id="1824307003" name=""/>
+                    <pic:cNvPicPr/>
+                  </pic:nvPicPr>
+                  <pic:blipFill>
+                    <a:blip r:embed="rId12"/>
+                    <a:stretch>
+                      <a:fillRect/>
+                    </a:stretch>
+                  </pic:blipFill>
+                  <pic:spPr>
+                    <a:xfrm>
+                      <a:off x="0" y="0"/>
+                      <a:ext cx="4138077" cy="3152820"/>
+                    </a:xfrm>
+                    <a:prstGeom prst="rect">
+                      <a:avLst/>
+                    </a:prstGeom>
+                  </pic:spPr>
+                </pic:pic>
+              </a:graphicData>
+            </a:graphic>
+          </wp:inline>
+        </w:drawing>
+      </w:r>
+    </w:p>
+    <w:p>
+      <w:pPr>
+        <w:rPr>
+          <w:sz w:val="28"/>
+          <w:lang w:bidi="ar-EG"/>
+        </w:rPr>
+      </w:pPr>
+      <w:proofErr w:type="gramStart"/>
+      <w:r>
+        <w:rPr>
+          <w:sz w:val="28"/>
+          <w:lang w:bidi="ar-EG"/>
+        </w:rPr>
+        <w:t>the</w:t>
+      </w:r>
+      <w:proofErr w:type="gramEnd"/>
+      <w:r>
+        <w:rPr>
+          <w:sz w:val="28"/>
+          <w:lang w:bidi="ar-EG"/>
+        </w:rPr>
+        <w:t xml:space="preserve"> variance increases rapidly with early components </w:t>
+      </w:r>
+      <w:r>
+        <w:rPr>
+          <w:sz w:val="28"/>
+          <w:lang w:bidi="ar-EG"/>
+        </w:rPr>
+        <w:t>hits a stopping point</w:t>
+      </w:r>
+      <w:r>
+        <w:rPr>
+          <w:sz w:val="28"/>
+          <w:lang w:bidi="ar-EG"/>
+        </w:rPr>
+        <w:t>:</w:t>
+      </w:r>
+    </w:p>
+    <w:p>
+      <w:pPr>
+        <w:pStyle w:val="ListParagraph"/>
+        <w:numPr>
+          <w:ilvl w:val="0"/>
+          <w:numId w:val="39"/>
+        </w:numPr>
+        <w:rPr>
+          <w:sz w:val="28"/>
+          <w:lang w:bidi="ar-EG"/>
+        </w:rPr>
+      </w:pPr>
+      <w:r>
+        <w:rPr>
+          <w:sz w:val="28"/>
+          <w:lang w:bidi="ar-EG"/>
+        </w:rPr>
+        <w:t>21 components capture 85% of the variance</w:t>
+      </w:r>
+    </w:p>
+    <w:p>
+      <w:pPr>
+        <w:pStyle w:val="ListParagraph"/>
+        <w:numPr>
+          <w:ilvl w:val="0"/>
+          <w:numId w:val="39"/>
+        </w:numPr>
+        <w:rPr>
+          <w:sz w:val="28"/>
+          <w:lang w:bidi="ar-EG"/>
+        </w:rPr>
+      </w:pPr>
+      <w:r>
+        <w:rPr>
+          <w:sz w:val="28"/>
+          <w:lang w:bidi="ar-EG"/>
+        </w:rPr>
+        <w:t>46 components capture 90% of the variance</w:t>
+      </w:r>
+    </w:p>
+    <w:p>
+      <w:pPr>
+        <w:pStyle w:val="ListParagraph"/>
+        <w:numPr>
+          <w:ilvl w:val="0"/>
+          <w:numId w:val="39"/>
+        </w:numPr>
+        <w:rPr>
+          <w:sz w:val="28"/>
+          <w:lang w:bidi="ar-EG"/>
+        </w:rPr>
+      </w:pPr>
+      <w:r>
+        <w:rPr>
+          <w:sz w:val="28"/>
+          <w:lang w:bidi="ar-EG"/>
+        </w:rPr>
+        <w:t>1</w:t>
+      </w:r>
+      <w:r>
+        <w:rPr>
+          <w:sz w:val="28"/>
+          <w:lang w:bidi="ar-EG"/>
+        </w:rPr>
+        <w:t>24 components capture 95% of the variance</w:t>
+      </w:r>
+    </w:p>
+    <w:p>
+      <w:pPr>
+        <w:pStyle w:val="ListParagraph"/>
+        <w:numPr>
+          <w:ilvl w:val="0"/>
+          <w:numId w:val="39"/>
+        </w:numPr>
+        <w:rPr>
+          <w:sz w:val="28"/>
+          <w:lang w:bidi="ar-EG"/>
+        </w:rPr>
+      </w:pPr>
+      <w:r>
+        <w:rPr>
+          <w:sz w:val="28"/>
+          <w:lang w:bidi="ar-EG"/>
+        </w:rPr>
+        <w:t>595 components capture 99% of the variance</w:t>
+      </w:r>
+    </w:p>
+    <w:p>
+      <w:pPr>
+        <w:rPr>
+          <w:sz w:val="28"/>
+          <w:lang w:bidi="ar-EG"/>
+        </w:rPr>
+      </w:pPr>
+    </w:p>
+    <w:p>
+      <w:pPr>
+        <w:rPr>
+          <w:sz w:val="28"/>
+          <w:lang w:bidi="ar-EG"/>
+        </w:rPr>
+      </w:pPr>
+    </w:p>
+    <w:p>
+      <w:pPr>
+        <w:rPr>
+          <w:sz w:val="28"/>
+          <w:lang w:bidi="ar-EG"/>
+        </w:rPr>
+      </w:pPr>
+    </w:p>
+    <w:p>
+      <w:pPr>
+        <w:rPr>
+          <w:sz w:val="28"/>
+          <w:lang w:bidi="ar-EG"/>
+        </w:rPr>
+      </w:pPr>
+    </w:p>
+    <w:p>
+      <w:pPr>
+        <w:rPr>
+          <w:sz w:val="28"/>
+          <w:lang w:bidi="ar-EG"/>
+        </w:rPr>
+      </w:pPr>
+    </w:p>
+    <w:p>
+      <w:pPr>
+        <w:rPr>
+          <w:sz w:val="28"/>
+          <w:lang w:bidi="ar-EG"/>
+        </w:rPr>
+      </w:pPr>
+    </w:p>
+    <w:p>
+      <w:pPr>
+        <w:rPr>
+          <w:sz w:val="28"/>
+          <w:lang w:bidi="ar-EG"/>
+        </w:rPr>
+      </w:pPr>
+    </w:p>
+    <w:p>
+      <w:pPr>
+        <w:rPr>
+          <w:b/>
+          <w:bCs/>
+          <w:sz w:val="28"/>
+          <w:lang w:bidi="ar-EG"/>
+        </w:rPr>
+      </w:pPr>
+      <w:r>
+        <w:rPr>
+          <w:b/>
+          <w:bCs/>
+          <w:sz w:val="28"/>
+          <w:lang w:bidi="ar-EG"/>
+        </w:rPr>
+        <w:lastRenderedPageBreak/>
+        <w:t>Performance vs. Time:</w:t>
+      </w:r>
+    </w:p>
+    <w:p>
+      <w:pPr>
+        <w:rPr>
+          <w:sz w:val="28"/>
+          <w:lang w:val="en-001" w:bidi="ar-EG"/>
+        </w:rPr>
+      </w:pPr>
+      <w:r>
+        <w:rPr>
+          <w:sz w:val="28"/>
+          <w:lang w:val="en-001" w:bidi="ar-EG"/>
+        </w:rPr>
+        <w:t xml:space="preserve">To evaluate the impact of PCA dimensionality reduction, we trained </w:t>
+      </w:r>
+      <w:r>
+        <w:rPr>
+          <w:sz w:val="28"/>
+          <w:lang w:val="en-001" w:bidi="ar-EG"/>
+        </w:rPr>
+        <w:t>both models</w:t>
+      </w:r>
+      <w:r>
+        <w:rPr>
+          <w:sz w:val="28"/>
+          <w:lang w:val="en-001" w:bidi="ar-EG"/>
+        </w:rPr>
+        <w:t xml:space="preserve"> at each variance threshold (85%, 90%, 95%, and 99%). We measured both classification performance (accuracy and macro F1-score) and total execution time, which included fitting the PCA, transforming the data, and training/</w:t>
+      </w:r>
+      <w:proofErr w:type="gramStart"/>
+      <w:r>
+        <w:rPr>
+          <w:sz w:val="28"/>
+          <w:lang w:val="en-001" w:bidi="ar-EG"/>
+        </w:rPr>
+        <w:t xml:space="preserve">evaluating </w:t>
+      </w:r>
+      <w:r>
+        <w:rPr>
+          <w:sz w:val="28"/>
+          <w:lang w:val="en-001" w:bidi="ar-EG"/>
+        </w:rPr>
+        <w:t xml:space="preserve"> both</w:t>
+      </w:r>
+      <w:proofErr w:type="gramEnd"/>
+      <w:r>
+        <w:rPr>
+          <w:sz w:val="28"/>
+          <w:lang w:val="en-001" w:bidi="ar-EG"/>
+        </w:rPr>
+        <w:t xml:space="preserve"> </w:t>
+      </w:r>
+      <w:proofErr w:type="gramStart"/>
+      <w:r>
+        <w:rPr>
+          <w:sz w:val="28"/>
+          <w:lang w:val="en-001" w:bidi="ar-EG"/>
+        </w:rPr>
+        <w:t>model</w:t>
+      </w:r>
+      <w:proofErr w:type="gramEnd"/>
+      <w:r>
+        <w:rPr>
+          <w:sz w:val="28"/>
+          <w:lang w:val="en-001" w:bidi="ar-EG"/>
+        </w:rPr>
+        <w:t>.</w:t>
+      </w:r>
+    </w:p>
+    <w:p>
+      <w:pPr>
+        <w:rPr>
+          <w:b/>
+          <w:bCs/>
+          <w:sz w:val="28"/>
+          <w:lang w:val="en-001" w:bidi="ar-EG"/>
+        </w:rPr>
+      </w:pPr>
+      <w:r>
+        <w:rPr>
+          <w:b/>
+          <w:bCs/>
+          <w:sz w:val="28"/>
+          <w:lang w:val="en-001" w:bidi="ar-EG"/>
+        </w:rPr>
+        <w:t>As shown in</w:t>
+      </w:r>
+      <w:r>
+        <w:rPr>
+          <w:b/>
+          <w:bCs/>
+          <w:sz w:val="28"/>
+          <w:lang w:val="en-001" w:bidi="ar-EG"/>
+        </w:rPr>
+        <w:t>:</w:t>
+      </w:r>
+    </w:p>
+    <w:p>
+      <w:pPr>
+        <w:rPr>
+          <w:sz w:val="28"/>
+          <w:lang w:val="en-001" w:bidi="ar-EG"/>
+        </w:rPr>
+      </w:pPr>
+      <w:r>
+        <w:rPr>
+          <w:b/>
+          <w:bCs/>
+          <w:lang w:bidi="ar-EG"/>
+        </w:rPr>
+        <w:drawing>
+          <wp:inline distT="0" distB="0" distL="0" distR="0" wp14:anchorId="00CE8C38" wp14:editId="0EE5EC68">
+            <wp:extent cx="4392051" cy="2903220"/>
+            <wp:effectExtent l="0" t="0" r="8890" b="0"/>
+            <wp:docPr id="42706422" name="Picture 1"/>
+            <wp:cNvGraphicFramePr>
+              <a:graphicFrameLocks xmlns:a="http://schemas.openxmlformats.org/drawingml/2006/main" noChangeAspect="1"/>
+            </wp:cNvGraphicFramePr>
+            <a:graphic xmlns:a="http://schemas.openxmlformats.org/drawingml/2006/main">
+              <a:graphicData uri="http://schemas.openxmlformats.org/drawingml/2006/picture">
+                <pic:pic xmlns:pic="http://schemas.openxmlformats.org/drawingml/2006/picture">
+                  <pic:nvPicPr>
+                    <pic:cNvPr id="42706422" name=""/>
+                    <pic:cNvPicPr/>
+                  </pic:nvPicPr>
+                  <pic:blipFill>
+                    <a:blip r:embed="rId13"/>
+                    <a:stretch>
+                      <a:fillRect/>
+                    </a:stretch>
+                  </pic:blipFill>
+                  <pic:spPr>
+                    <a:xfrm>
+                      <a:off x="0" y="0"/>
+                      <a:ext cx="4395000" cy="2905170"/>
+                    </a:xfrm>
+                    <a:prstGeom prst="rect">
+                      <a:avLst/>
+                    </a:prstGeom>
+                  </pic:spPr>
+                </pic:pic>
+              </a:graphicData>
+            </a:graphic>
+          </wp:inline>
+        </w:drawing>
+      </w:r>
+      <w:r>
+        <w:rPr>
+          <w:sz w:val="28"/>
+          <w:lang w:val="en-001" w:bidi="ar-EG"/>
+        </w:rPr>
+        <w:br/>
+      </w:r>
+      <w:r>
+        <w:rPr>
+          <w:sz w:val="28"/>
+          <w:lang w:val="en-001" w:bidi="ar-EG"/>
+        </w:rPr>
+        <w:t>model performance improved steadily as we retained more variance. Increasing from 85% to 95% variance yielded a notable gain in F1-score, indicating that the additional components preserved meaningful information. However, pushing to 99% variance produced only a marginal improvement, suggesting diminishing returns beyond the 95% threshold.</w:t>
+      </w:r>
+    </w:p>
+    <w:p>
+      <w:pPr>
+        <w:rPr>
+          <w:sz w:val="28"/>
+          <w:lang w:val="en-001" w:bidi="ar-EG"/>
+        </w:rPr>
+      </w:pPr>
+    </w:p>
+    <w:p>
+      <w:pPr>
+        <w:rPr>
+          <w:sz w:val="28"/>
+          <w:lang w:val="en-001" w:bidi="ar-EG"/>
+        </w:rPr>
+      </w:pPr>
+    </w:p>
+    <w:p>
+      <w:pPr>
+        <w:rPr>
+          <w:sz w:val="28"/>
+          <w:lang w:val="en-001" w:bidi="ar-EG"/>
+        </w:rPr>
+      </w:pPr>
+    </w:p>
+    <w:p>
+      <w:pPr>
+        <w:rPr>
+          <w:sz w:val="28"/>
+          <w:lang w:val="en-001" w:bidi="ar-EG"/>
+        </w:rPr>
+      </w:pPr>
+    </w:p>
+    <w:p>
+      <w:pPr>
+        <w:rPr>
+          <w:sz w:val="28"/>
+          <w:lang w:val="en-001" w:bidi="ar-EG"/>
+        </w:rPr>
+      </w:pPr>
+    </w:p>
+    <w:p>
+      <w:pPr>
+        <w:rPr>
+          <w:sz w:val="28"/>
+          <w:lang w:val="en-001" w:bidi="ar-EG"/>
+        </w:rPr>
+      </w:pPr>
+    </w:p>
+    <w:p>
+      <w:pPr>
+        <w:rPr>
+          <w:sz w:val="28"/>
+          <w:lang w:val="en-001" w:bidi="ar-EG"/>
+        </w:rPr>
+      </w:pPr>
+    </w:p>
+    <w:p>
+      <w:pPr>
+        <w:rPr>
+          <w:sz w:val="28"/>
+          <w:lang w:val="en-001" w:bidi="ar-EG"/>
+        </w:rPr>
+      </w:pPr>
+    </w:p>
+    <w:p>
+      <w:pPr>
+        <w:rPr>
+          <w:b/>
+          <w:bCs/>
+          <w:sz w:val="28"/>
+          <w:lang w:val="en-001" w:bidi="ar-EG"/>
+        </w:rPr>
+      </w:pPr>
+      <w:r>
+        <w:rPr>
+          <w:b/>
+          <w:bCs/>
+          <w:sz w:val="28"/>
+          <w:lang w:val="en-001" w:bidi="ar-EG"/>
+        </w:rPr>
+        <w:lastRenderedPageBreak/>
+        <w:t>Regarding computational cost</w:t>
+      </w:r>
+      <w:r>
+        <w:rPr>
+          <w:b/>
+          <w:bCs/>
+          <w:sz w:val="28"/>
+          <w:lang w:val="en-001" w:bidi="ar-EG"/>
+        </w:rPr>
+        <w:t xml:space="preserve">: </w:t>
+      </w:r>
+    </w:p>
+    <w:p>
+      <w:pPr>
+        <w:rPr>
+          <w:sz w:val="28"/>
+          <w:lang w:val="en-001" w:bidi="ar-EG"/>
+        </w:rPr>
+      </w:pPr>
+      <w:r>
+        <w:rPr>
+          <w:b/>
+          <w:bCs/>
+          <w:lang w:bidi="ar-EG"/>
+        </w:rPr>
+        <w:drawing>
+          <wp:inline distT="0" distB="0" distL="0" distR="0" wp14:anchorId="37375C6A" wp14:editId="61E10E6B">
+            <wp:extent cx="4376420" cy="3451860"/>
+            <wp:effectExtent l="0" t="0" r="5080" b="0"/>
+            <wp:docPr id="1740350033" name="Picture 1"/>
+            <wp:cNvGraphicFramePr>
+              <a:graphicFrameLocks xmlns:a="http://schemas.openxmlformats.org/drawingml/2006/main" noChangeAspect="1"/>
+            </wp:cNvGraphicFramePr>
+            <a:graphic xmlns:a="http://schemas.openxmlformats.org/drawingml/2006/main">
+              <a:graphicData uri="http://schemas.openxmlformats.org/drawingml/2006/picture">
+                <pic:pic xmlns:pic="http://schemas.openxmlformats.org/drawingml/2006/picture">
+                  <pic:nvPicPr>
+                    <pic:cNvPr id="1740350033" name=""/>
+                    <pic:cNvPicPr/>
+                  </pic:nvPicPr>
+                  <pic:blipFill>
+                    <a:blip r:embed="rId14"/>
+                    <a:stretch>
+                      <a:fillRect/>
+                    </a:stretch>
+                  </pic:blipFill>
+                  <pic:spPr>
+                    <a:xfrm>
+                      <a:off x="0" y="0"/>
+                      <a:ext cx="4380903" cy="3455396"/>
+                    </a:xfrm>
+                    <a:prstGeom prst="rect">
+                      <a:avLst/>
+                    </a:prstGeom>
+                  </pic:spPr>
+                </pic:pic>
+              </a:graphicData>
+            </a:graphic>
+          </wp:inline>
+        </w:drawing>
+      </w:r>
+    </w:p>
+    <w:p>
+      <w:pPr>
+        <w:rPr>
+          <w:sz w:val="28"/>
+          <w:lang w:val="en-001" w:bidi="ar-EG"/>
+        </w:rPr>
+      </w:pPr>
+      <w:r>
+        <w:rPr>
+          <w:sz w:val="28"/>
+          <w:lang w:val="en-001" w:bidi="ar-EG"/>
+        </w:rPr>
+        <w:t>reveals a sharp increase in time when moving from 95% to 99% variance. While the 95% threshold required 124 components and completed in [value] seconds, the 99% threshold demanded 595 components – nearly five times as many</w:t>
+      </w:r>
+      <w:r>
+        <w:rPr>
+          <w:sz w:val="28"/>
+          <w:lang w:val="en-001" w:bidi="ar-EG"/>
+        </w:rPr>
+        <w:t xml:space="preserve">, </w:t>
+      </w:r>
+      <w:r>
+        <w:rPr>
+          <w:sz w:val="28"/>
+          <w:lang w:val="en-001" w:bidi="ar-EG"/>
+        </w:rPr>
+        <w:t xml:space="preserve">resulting in </w:t>
+      </w:r>
+      <w:r>
+        <w:rPr>
+          <w:sz w:val="28"/>
+          <w:lang w:val="en-001" w:bidi="ar-EG"/>
+        </w:rPr>
+        <w:t xml:space="preserve">a </w:t>
+      </w:r>
+      <w:r>
+        <w:rPr>
+          <w:sz w:val="28"/>
+          <w:lang w:val="en-001" w:bidi="ar-EG"/>
+        </w:rPr>
+        <w:t>longer execution. Lower thresholds (85% and 90%) were faster but came at the cost of reduced predictive accuracy.</w:t>
+      </w:r>
+    </w:p>
+    <w:p>
+      <w:pPr>
+        <w:rPr>
+          <w:sz w:val="28"/>
+          <w:lang w:val="en-001" w:bidi="ar-EG"/>
+        </w:rPr>
+      </w:pPr>
+      <w:r>
+        <w:rPr>
+          <w:sz w:val="28"/>
+          <w:lang w:val="en-001" w:bidi="ar-EG"/>
+        </w:rPr>
+        <w:t>Based on this trade-off analysis, we selected </w:t>
+      </w:r>
+      <w:r>
+        <w:rPr>
+          <w:bCs/>
+          <w:sz w:val="28"/>
+          <w:lang w:val="en-001" w:bidi="ar-EG"/>
+        </w:rPr>
+        <w:t>124 components (95% variance)</w:t>
+      </w:r>
+      <w:r>
+        <w:rPr>
+          <w:sz w:val="28"/>
+          <w:lang w:val="en-001" w:bidi="ar-EG"/>
+        </w:rPr>
+        <w:t> as the optimal configuration. This choice reduces the feature space from 3,072 to 124 dimensions (a 96% reduction) while achieving strong classification performance (0.880 accuracy, 0.884 F1-score</w:t>
+      </w:r>
+      <w:r>
+        <w:rPr>
+          <w:sz w:val="28"/>
+          <w:lang w:val="en-001" w:bidi="ar-EG"/>
+        </w:rPr>
+        <w:t xml:space="preserve"> on KNN</w:t>
+      </w:r>
+      <w:r>
+        <w:rPr>
+          <w:sz w:val="28"/>
+          <w:lang w:val="en-001" w:bidi="ar-EG"/>
+        </w:rPr>
+        <w:t>) with reasonable computational cost. This balance makes it well-suited for real-time traffic sign recognition applications.</w:t>
+      </w:r>
+    </w:p>
+    <w:p>
+      <w:pPr>
+        <w:rPr>
+          <w:sz w:val="28"/>
+          <w:lang w:val="en-001" w:bidi="ar-EG"/>
+        </w:rPr>
+      </w:pPr>
+    </w:p>
+    <w:p>
+      <w:pPr>
+        <w:rPr>
+          <w:sz w:val="28"/>
+          <w:lang w:bidi="ar-EG"/>
+        </w:rPr>
+      </w:pPr>
+    </w:p>
+    <w:p>
+      <w:pPr>
+        <w:rPr>
+          <w:sz w:val="28"/>
+          <w:lang w:bidi="ar-EG"/>
+        </w:rPr>
+      </w:pPr>
+    </w:p>
+    <w:p>
+      <w:pPr>
+        <w:rPr>
+          <w:sz w:val="28"/>
+          <w:lang w:bidi="ar-EG"/>
+        </w:rPr>
+      </w:pPr>
+    </w:p>
+    <w:p>
+      <w:pPr>
+        <w:rPr>
+          <w:b/>
+          <w:bCs/>
+          <w:sz w:val="28"/>
+          <w:lang w:bidi="ar-EG"/>
+        </w:rPr>
+      </w:pPr>
+    </w:p>
+    <w:p>
+      <w:pPr>
+        <w:rPr>
+          <w:b/>
+          <w:bCs/>
+          <w:sz w:val="28"/>
+          <w:lang w:bidi="ar-EG"/>
+        </w:rPr>
+      </w:pPr>
+    </w:p>
+    <w:p>
+      <w:pPr>
+        <w:rPr>
+          <w:b/>
+          <w:bCs/>
+          <w:sz w:val="28"/>
+          <w:lang w:bidi="ar-EG"/>
+        </w:rPr>
+      </w:pPr>
+    </w:p>
+    <w:p>
+      <w:pPr>
+        <w:rPr>
+          <w:b/>
+          <w:bCs/>
+          <w:sz w:val="28"/>
+          <w:lang w:bidi="ar-EG"/>
+        </w:rPr>
+      </w:pPr>
+      <w:r>
+        <w:rPr>
+          <w:b/>
+          <w:bCs/>
+          <w:sz w:val="28"/>
+          <w:lang w:bidi="ar-EG"/>
+        </w:rPr>
+        <w:lastRenderedPageBreak/>
+        <w:t>Conclusion:</w:t>
+      </w:r>
+    </w:p>
+    <w:p>
+      <w:pPr>
+        <w:rPr>
+          <w:sz w:val="28"/>
+          <w:lang w:bidi="ar-EG"/>
+        </w:rPr>
+      </w:pPr>
+      <w:r>
+        <w:rPr>
+          <w:sz w:val="28"/>
+          <w:lang w:bidi="ar-EG"/>
+        </w:rPr>
+        <w:t xml:space="preserve"> Moving from 90% to 95% variance improved performance (F1-Score increased to 0.884) with modest time cost. However, 99% required far more components (595) with diminishing returns (see Figure [Z] – Execution Time Comparison). We selected 124 components (95% variance) as the optimal balance, reducing features from 3,072 to 124 while preserving critical information</w:t>
+      </w:r>
+      <w:r>
+        <w:rPr>
+          <w:sz w:val="28"/>
+          <w:lang w:bidi="ar-EG"/>
+        </w:rPr>
+        <w:t>.</w:t>
+      </w:r>
+    </w:p>
+    <w:p>
+      <w:pPr>
+        <w:rPr>
+          <w:b/>
+          <w:bCs/>
+          <w:sz w:val="28"/>
+          <w:lang w:bidi="ar-EG"/>
+        </w:rPr>
+      </w:pPr>
+      <w:r>
+        <w:rPr>
+          <w:b/>
+          <w:bCs/>
+          <w:sz w:val="28"/>
+          <w:lang w:bidi="ar-EG"/>
+        </w:rPr>
+        <w:t>Confusion matrix for 95% variance on KNN:</w:t>
+      </w:r>
+      <w:r>
+        <w:rPr>
+          <w:b/>
+          <w:bCs/>
+          <w:lang w:bidi="ar-EG"/>
+        </w:rPr>
+        <w:drawing>
+          <wp:inline distT="0" distB="0" distL="0" distR="0" wp14:anchorId="5DCC7BFF" wp14:editId="08BDC699">
+            <wp:extent cx="4903761" cy="4015740"/>
+            <wp:effectExtent l="0" t="0" r="0" b="3810"/>
+            <wp:docPr id="1720462803" name="Picture 1"/>
+            <wp:cNvGraphicFramePr>
+              <a:graphicFrameLocks xmlns:a="http://schemas.openxmlformats.org/drawingml/2006/main" noChangeAspect="1"/>
+            </wp:cNvGraphicFramePr>
+            <a:graphic xmlns:a="http://schemas.openxmlformats.org/drawingml/2006/main">
+              <a:graphicData uri="http://schemas.openxmlformats.org/drawingml/2006/picture">
+                <pic:pic xmlns:pic="http://schemas.openxmlformats.org/drawingml/2006/picture">
+                  <pic:nvPicPr>
+                    <pic:cNvPr id="1720462803" name=""/>
+                    <pic:cNvPicPr/>
+                  </pic:nvPicPr>
+                  <pic:blipFill>
+                    <a:blip r:embed="rId15"/>
+                    <a:stretch>
+                      <a:fillRect/>
+                    </a:stretch>
+                  </pic:blipFill>
+                  <pic:spPr>
+                    <a:xfrm>
+                      <a:off x="0" y="0"/>
+                      <a:ext cx="4909266" cy="4020248"/>
+                    </a:xfrm>
+                    <a:prstGeom prst="rect">
+                      <a:avLst/>
+                    </a:prstGeom>
+                  </pic:spPr>
+                </pic:pic>
+              </a:graphicData>
+            </a:graphic>
+          </wp:inline>
+        </w:drawing>
+      </w:r>
+    </w:p>
+    <w:p>
+      <w:pPr>
+        <w:pStyle w:val="Heading2"/>
+        <w:rPr>
+          <w:b/>
+          <w:bCs/>
+          <w:lang w:bidi="ar-EG"/>
+        </w:rPr>
+      </w:pPr>
+    </w:p>
+    <w:p>
+      <w:pPr>
+        <w:pStyle w:val="Heading2"/>
+        <w:rPr>
+          <w:b/>
+          <w:bCs/>
+          <w:lang w:bidi="ar-EG"/>
+        </w:rPr>
+      </w:pPr>
+    </w:p>
+    <w:p>
+      <w:pPr>
+        <w:pStyle w:val="Heading2"/>
+        <w:rPr>
+          <w:b/>
+          <w:bCs/>
+          <w:lang w:bidi="ar-EG"/>
+        </w:rPr>
+      </w:pPr>
+    </w:p>
+    <w:p>
+      <w:pPr>
+        <w:rPr>
+          <w:lang w:bidi="ar-EG"/>
+        </w:rPr>
+      </w:pPr>
+    </w:p>
+    <w:p>
+      <w:pPr>
+        <w:pStyle w:val="Heading2"/>
+        <w:rPr>
+          <w:b/>
+          <w:bCs/>
+          <w:lang w:bidi="ar-EG"/>
+        </w:rPr>
+      </w:pPr>
+    </w:p>
+    <w:p>
+      <w:pPr>
+        <w:rPr>
+          <w:lang w:bidi="ar-EG"/>
+        </w:rPr>
+      </w:pPr>
+    </w:p>
+    <w:p>
+      <w:pPr>
+        <w:rPr>
+          <w:lang w:bidi="ar-EG"/>
+        </w:rPr>
+      </w:pPr>
+    </w:p>
+    <w:p>
+      <w:pPr>
+        <w:pStyle w:val="Heading2"/>
+        <w:rPr>
+          <w:b/>
+          <w:bCs/>
+          <w:lang w:bidi="ar-EG"/>
+        </w:rPr>
+      </w:pPr>
+      <w:r>
+        <w:rPr>
+          <w:b/>
+          <w:bCs/>
+          <w:lang w:bidi="ar-EG"/>
+        </w:rPr>
+        <w:lastRenderedPageBreak/>
+        <w:t>3.</w:t>
+      </w:r>
+      <w:r>
+        <w:rPr>
+          <w:b/>
+          <w:bCs/>
+          <w:lang w:bidi="ar-EG"/>
+        </w:rPr>
+        <w:t>5</w:t>
+      </w:r>
+      <w:r>
+        <w:rPr>
+          <w:b/>
+          <w:bCs/>
+          <w:lang w:bidi="ar-EG"/>
+        </w:rPr>
+        <w:t xml:space="preserve"> Hyperparameter Optimization (grid_search.py)</w:t>
       </w:r>
     </w:p>
     <w:p>
@@ -2281,6 +3818,219 @@
     </w:p>
     <w:p>
       <w:pPr>
+        <w:tabs>
+          <w:tab w:val="num" w:pos="1440"/>
+        </w:tabs>
+        <w:rPr>
+          <w:sz w:val="28"/>
+          <w:szCs w:val="28"/>
+          <w:lang w:bidi="ar-EG"/>
+        </w:rPr>
+      </w:pPr>
+    </w:p>
+    <w:p>
+      <w:pPr>
+        <w:tabs>
+          <w:tab w:val="num" w:pos="1440"/>
+        </w:tabs>
+        <w:rPr>
+          <w:sz w:val="28"/>
+          <w:szCs w:val="28"/>
+          <w:lang w:bidi="ar-EG"/>
+        </w:rPr>
+      </w:pPr>
+    </w:p>
+    <w:p>
+      <w:pPr>
+        <w:tabs>
+          <w:tab w:val="num" w:pos="1440"/>
+        </w:tabs>
+        <w:rPr>
+          <w:sz w:val="28"/>
+          <w:szCs w:val="28"/>
+          <w:lang w:bidi="ar-EG"/>
+        </w:rPr>
+      </w:pPr>
+    </w:p>
+    <w:p>
+      <w:pPr>
+        <w:tabs>
+          <w:tab w:val="num" w:pos="1440"/>
+        </w:tabs>
+        <w:rPr>
+          <w:sz w:val="28"/>
+          <w:szCs w:val="28"/>
+          <w:lang w:bidi="ar-EG"/>
+        </w:rPr>
+      </w:pPr>
+    </w:p>
+    <w:p>
+      <w:pPr>
+        <w:tabs>
+          <w:tab w:val="num" w:pos="1440"/>
+        </w:tabs>
+        <w:rPr>
+          <w:sz w:val="28"/>
+          <w:szCs w:val="28"/>
+          <w:lang w:bidi="ar-EG"/>
+        </w:rPr>
+      </w:pPr>
+    </w:p>
+    <w:p>
+      <w:pPr>
+        <w:tabs>
+          <w:tab w:val="num" w:pos="1440"/>
+        </w:tabs>
+        <w:rPr>
+          <w:sz w:val="28"/>
+          <w:szCs w:val="28"/>
+          <w:lang w:bidi="ar-EG"/>
+        </w:rPr>
+      </w:pPr>
+    </w:p>
+    <w:p>
+      <w:pPr>
+        <w:tabs>
+          <w:tab w:val="num" w:pos="1440"/>
+        </w:tabs>
+        <w:rPr>
+          <w:sz w:val="28"/>
+          <w:szCs w:val="28"/>
+          <w:lang w:bidi="ar-EG"/>
+        </w:rPr>
+      </w:pPr>
+    </w:p>
+    <w:p>
+      <w:pPr>
+        <w:tabs>
+          <w:tab w:val="num" w:pos="1440"/>
+        </w:tabs>
+        <w:rPr>
+          <w:b/>
+          <w:bCs/>
+          <w:sz w:val="36"/>
+          <w:szCs w:val="28"/>
+          <w:lang w:bidi="ar-EG"/>
+        </w:rPr>
+      </w:pPr>
+      <w:r>
+        <w:rPr>
+          <w:b/>
+          <w:bCs/>
+          <w:sz w:val="36"/>
+          <w:szCs w:val="28"/>
+          <w:lang w:bidi="ar-EG"/>
+        </w:rPr>
+        <w:lastRenderedPageBreak/>
+        <w:t>Grid S</w:t>
+      </w:r>
+      <w:r>
+        <w:rPr>
+          <w:b/>
+          <w:bCs/>
+          <w:sz w:val="36"/>
+          <w:szCs w:val="28"/>
+          <w:lang w:bidi="ar-EG"/>
+        </w:rPr>
+        <w:t>e</w:t>
+      </w:r>
+      <w:r>
+        <w:rPr>
+          <w:b/>
+          <w:bCs/>
+          <w:sz w:val="36"/>
+          <w:szCs w:val="28"/>
+          <w:lang w:bidi="ar-EG"/>
+        </w:rPr>
+        <w:t>a</w:t>
+      </w:r>
+      <w:r>
+        <w:rPr>
+          <w:b/>
+          <w:bCs/>
+          <w:sz w:val="36"/>
+          <w:szCs w:val="28"/>
+          <w:lang w:bidi="ar-EG"/>
+        </w:rPr>
+        <w:t>r</w:t>
+      </w:r>
+      <w:r>
+        <w:rPr>
+          <w:b/>
+          <w:bCs/>
+          <w:sz w:val="36"/>
+          <w:szCs w:val="28"/>
+          <w:lang w:bidi="ar-EG"/>
+        </w:rPr>
+        <w:t>ch results</w:t>
+      </w:r>
+      <w:r>
+        <w:rPr>
+          <w:b/>
+          <w:bCs/>
+          <w:sz w:val="36"/>
+          <w:szCs w:val="28"/>
+          <w:lang w:bidi="ar-EG"/>
+        </w:rPr>
+        <w:t xml:space="preserve"> on KNN</w:t>
+      </w:r>
+    </w:p>
+    <w:p>
+      <w:pPr>
+        <w:tabs>
+          <w:tab w:val="num" w:pos="1440"/>
+        </w:tabs>
+        <w:rPr>
+          <w:sz w:val="28"/>
+          <w:szCs w:val="28"/>
+          <w:lang w:bidi="ar-EG"/>
+        </w:rPr>
+      </w:pPr>
+      <w:r>
+        <w:rPr>
+          <w:sz w:val="28"/>
+          <w:szCs w:val="28"/>
+          <w:lang w:bidi="ar-EG"/>
+        </w:rPr>
+        <w:drawing>
+          <wp:inline distT="0" distB="0" distL="0" distR="0" wp14:anchorId="621BECC7" wp14:editId="01235005">
+            <wp:extent cx="5577840" cy="4570730"/>
+            <wp:effectExtent l="0" t="0" r="3810" b="1270"/>
+            <wp:docPr id="1194679043" name="Picture 1"/>
+            <wp:cNvGraphicFramePr>
+              <a:graphicFrameLocks xmlns:a="http://schemas.openxmlformats.org/drawingml/2006/main" noChangeAspect="1"/>
+            </wp:cNvGraphicFramePr>
+            <a:graphic xmlns:a="http://schemas.openxmlformats.org/drawingml/2006/main">
+              <a:graphicData uri="http://schemas.openxmlformats.org/drawingml/2006/picture">
+                <pic:pic xmlns:pic="http://schemas.openxmlformats.org/drawingml/2006/picture">
+                  <pic:nvPicPr>
+                    <pic:cNvPr id="1194679043" name=""/>
+                    <pic:cNvPicPr/>
+                  </pic:nvPicPr>
+                  <pic:blipFill>
+                    <a:blip r:embed="rId16"/>
+                    <a:stretch>
+                      <a:fillRect/>
+                    </a:stretch>
+                  </pic:blipFill>
+                  <pic:spPr>
+                    <a:xfrm>
+                      <a:off x="0" y="0"/>
+                      <a:ext cx="5577840" cy="4570730"/>
+                    </a:xfrm>
+                    <a:prstGeom prst="rect">
+                      <a:avLst/>
+                    </a:prstGeom>
+                  </pic:spPr>
+                </pic:pic>
+              </a:graphicData>
+            </a:graphic>
+          </wp:inline>
+        </w:drawing>
+      </w:r>
+    </w:p>
+    <w:p>
+      <w:pPr>
         <w:pStyle w:val="Heading2"/>
         <w:rPr>
           <w:b/>
@@ -2294,7 +4044,23 @@
           <w:bCs/>
           <w:lang w:bidi="ar-EG"/>
         </w:rPr>
-        <w:t>3.5 Ensemble Methods (ensamble.py)</w:t>
+        <w:t>3.</w:t>
+      </w:r>
+      <w:r>
+        <w:rPr>
+          <w:b/>
+          <w:bCs/>
+          <w:lang w:bidi="ar-EG"/>
+        </w:rPr>
+        <w:t>6</w:t>
+      </w:r>
+      <w:r>
+        <w:rPr>
+          <w:b/>
+          <w:bCs/>
+          <w:lang w:bidi="ar-EG"/>
+        </w:rPr>
+        <w:t xml:space="preserve"> Ensemble Methods (ensamble.py)</w:t>
       </w:r>
     </w:p>
     <w:p>
@@ -2404,6 +4170,7 @@
         <w:rPr>
           <w:lang w:bidi="ar-EG"/>
         </w:rPr>
+        <w:lastRenderedPageBreak/>
         <w:t>2. Boosting (Gradient Boosting &amp; AdaBoost):</w:t>
       </w:r>
     </w:p>
@@ -2671,7 +4438,89 @@
           <w:szCs w:val="28"/>
           <w:lang w:bidi="ar-EG"/>
         </w:rPr>
-        <w:t xml:space="preserve"> by classifier j. This synergistic approach ensures that the weaknesses of one classifier are compensated for by the strengths of another, resulting in the highest accuracy achievable within Phase 1.</w:t>
+        <w:t xml:space="preserve"> by classifier j. This synergistic approach ensures that the weaknesses of one classifier are compensated for by the strengths of another</w:t>
+      </w:r>
+      <w:r>
+        <w:rPr>
+          <w:sz w:val="28"/>
+          <w:szCs w:val="28"/>
+          <w:lang w:bidi="ar-EG"/>
+        </w:rPr>
+        <w:t>.</w:t>
+      </w:r>
+    </w:p>
+    <w:p>
+      <w:pPr>
+        <w:ind w:left="720"/>
+        <w:rPr>
+          <w:b/>
+          <w:bCs/>
+          <w:sz w:val="36"/>
+          <w:szCs w:val="28"/>
+          <w:lang w:bidi="ar-EG"/>
+        </w:rPr>
+      </w:pPr>
+      <w:r>
+        <w:rPr>
+          <w:b/>
+          <w:bCs/>
+          <w:sz w:val="36"/>
+          <w:szCs w:val="28"/>
+          <w:lang w:bidi="ar-EG"/>
+        </w:rPr>
+        <w:t>Bagging (Random Forest) vs Boosting:</w:t>
+      </w:r>
+    </w:p>
+    <w:p>
+      <w:pPr>
+        <w:ind w:left="720"/>
+        <w:rPr>
+          <w:sz w:val="28"/>
+          <w:szCs w:val="28"/>
+          <w:lang w:bidi="ar-EG"/>
+        </w:rPr>
+      </w:pPr>
+      <w:r>
+        <w:rPr>
+          <w:sz w:val="28"/>
+          <w:szCs w:val="28"/>
+          <w:lang w:bidi="ar-EG"/>
+        </w:rPr>
+        <w:drawing>
+          <wp:inline distT="0" distB="0" distL="0" distR="0" wp14:anchorId="4228B1D7" wp14:editId="01844A34">
+            <wp:extent cx="5292913" cy="3383280"/>
+            <wp:effectExtent l="0" t="0" r="3175" b="7620"/>
+            <wp:docPr id="752152245" name="Picture 1"/>
+            <wp:cNvGraphicFramePr>
+              <a:graphicFrameLocks xmlns:a="http://schemas.openxmlformats.org/drawingml/2006/main" noChangeAspect="1"/>
+            </wp:cNvGraphicFramePr>
+            <a:graphic xmlns:a="http://schemas.openxmlformats.org/drawingml/2006/main">
+              <a:graphicData uri="http://schemas.openxmlformats.org/drawingml/2006/picture">
+                <pic:pic xmlns:pic="http://schemas.openxmlformats.org/drawingml/2006/picture">
+                  <pic:nvPicPr>
+                    <pic:cNvPr id="752152245" name=""/>
+                    <pic:cNvPicPr/>
+                  </pic:nvPicPr>
+                  <pic:blipFill>
+                    <a:blip r:embed="rId17"/>
+                    <a:stretch>
+                      <a:fillRect/>
+                    </a:stretch>
+                  </pic:blipFill>
+                  <pic:spPr>
+                    <a:xfrm>
+                      <a:off x="0" y="0"/>
+                      <a:ext cx="5297106" cy="3385960"/>
+                    </a:xfrm>
+                    <a:prstGeom prst="rect">
+                      <a:avLst/>
+                    </a:prstGeom>
+                  </pic:spPr>
+                </pic:pic>
+              </a:graphicData>
+            </a:graphic>
+          </wp:inline>
+        </w:drawing>
       </w:r>
     </w:p>
     <w:p>
@@ -2685,6 +4534,7 @@
         <w:rPr>
           <w:lang w:bidi="ar-EG"/>
         </w:rPr>
+        <w:lastRenderedPageBreak/>
         <w:t xml:space="preserve"> Phase 2: Deep Learning, Architectures &amp; Interpretability</w:t>
       </w:r>
     </w:p>
@@ -3268,6 +5118,7 @@
           <w:szCs w:val="28"/>
           <w:lang w:bidi="ar-EG"/>
         </w:rPr>
+        <w:lastRenderedPageBreak/>
         <w:t>Dense Layer 1:</w:t>
       </w:r>
       <w:r>
@@ -3601,6 +5452,15 @@
     </w:p>
     <w:p>
       <w:pPr>
+        <w:rPr>
+          <w:sz w:val="28"/>
+          <w:szCs w:val="28"/>
+          <w:lang w:bidi="ar-EG"/>
+        </w:rPr>
+      </w:pPr>
+    </w:p>
+    <w:p>
+      <w:pPr>
         <w:pStyle w:val="Heading2"/>
         <w:rPr>
           <w:b/>
@@ -3690,6 +5550,7 @@
           <w:szCs w:val="28"/>
           <w:lang w:bidi="ar-EG"/>
         </w:rPr>
+        <w:lastRenderedPageBreak/>
         <w:t>Learned Filter Visualizations:</w:t>
       </w:r>
       <w:r>
@@ -3821,12 +5682,127 @@
           <w:lang w:bidi="ar-EG"/>
         </w:rPr>
       </w:pPr>
-      <w:r>
-        <w:rPr>
-          <w:b/>
-          <w:bCs/>
-          <w:lang w:bidi="ar-EG"/>
-        </w:rPr>
+    </w:p>
+    <w:p>
+      <w:pPr>
+        <w:pStyle w:val="Heading2"/>
+        <w:rPr>
+          <w:b/>
+          <w:bCs/>
+          <w:lang w:bidi="ar-EG"/>
+        </w:rPr>
+      </w:pPr>
+    </w:p>
+    <w:p>
+      <w:pPr>
+        <w:pStyle w:val="Heading2"/>
+        <w:rPr>
+          <w:b/>
+          <w:bCs/>
+          <w:lang w:bidi="ar-EG"/>
+        </w:rPr>
+      </w:pPr>
+    </w:p>
+    <w:p>
+      <w:pPr>
+        <w:pStyle w:val="Heading2"/>
+        <w:rPr>
+          <w:b/>
+          <w:bCs/>
+          <w:lang w:bidi="ar-EG"/>
+        </w:rPr>
+      </w:pPr>
+    </w:p>
+    <w:p>
+      <w:pPr>
+        <w:pStyle w:val="Heading2"/>
+        <w:rPr>
+          <w:b/>
+          <w:bCs/>
+          <w:lang w:bidi="ar-EG"/>
+        </w:rPr>
+      </w:pPr>
+    </w:p>
+    <w:p>
+      <w:pPr>
+        <w:pStyle w:val="Heading2"/>
+        <w:rPr>
+          <w:b/>
+          <w:bCs/>
+          <w:lang w:bidi="ar-EG"/>
+        </w:rPr>
+      </w:pPr>
+    </w:p>
+    <w:p>
+      <w:pPr>
+        <w:pStyle w:val="Heading2"/>
+        <w:rPr>
+          <w:b/>
+          <w:bCs/>
+          <w:lang w:bidi="ar-EG"/>
+        </w:rPr>
+      </w:pPr>
+    </w:p>
+    <w:p>
+      <w:pPr>
+        <w:pStyle w:val="Heading2"/>
+        <w:rPr>
+          <w:b/>
+          <w:bCs/>
+          <w:lang w:bidi="ar-EG"/>
+        </w:rPr>
+      </w:pPr>
+    </w:p>
+    <w:p>
+      <w:pPr>
+        <w:pStyle w:val="Heading2"/>
+        <w:rPr>
+          <w:b/>
+          <w:bCs/>
+          <w:lang w:bidi="ar-EG"/>
+        </w:rPr>
+      </w:pPr>
+    </w:p>
+    <w:p>
+      <w:pPr>
+        <w:pStyle w:val="Heading2"/>
+        <w:rPr>
+          <w:b/>
+          <w:bCs/>
+          <w:lang w:bidi="ar-EG"/>
+        </w:rPr>
+      </w:pPr>
+    </w:p>
+    <w:p>
+      <w:pPr>
+        <w:rPr>
+          <w:lang w:bidi="ar-EG"/>
+        </w:rPr>
+      </w:pPr>
+    </w:p>
+    <w:p>
+      <w:pPr>
+        <w:rPr>
+          <w:lang w:bidi="ar-EG"/>
+        </w:rPr>
+      </w:pPr>
+    </w:p>
+    <w:p>
+      <w:pPr>
+        <w:pStyle w:val="Heading2"/>
+        <w:rPr>
+          <w:b/>
+          <w:bCs/>
+          <w:lang w:bidi="ar-EG"/>
+        </w:rPr>
+      </w:pPr>
+      <w:r>
+        <w:rPr>
+          <w:b/>
+          <w:bCs/>
+          <w:lang w:bidi="ar-EG"/>
+        </w:rPr>
+        <w:lastRenderedPageBreak/>
         <w:t>4.4 Transfer Learning: VGG16</w:t>
       </w:r>
     </w:p>
@@ -3968,8 +5944,91 @@
           <w:szCs w:val="28"/>
           <w:lang w:bidi="ar-EG"/>
         </w:rPr>
-        <w:t xml:space="preserve"> The convolutional base was "unfrozen," and the entire network was trained simultaneously with an exceptionally low learning rate (e.g., 1e-5). This gently aligns the ImageNet-learned features to the specific visual domain of German traffic signs.</w:t>
-      </w:r>
+        <w:t xml:space="preserve"> The convolutional base was "unfrozen," and the entire network was trained simultaneously with an exceptionally low learning rate (e.g., 1e-5). This gently aligns the ImageNet-learned</w:t>
+      </w:r>
+      <w:r>
+        <w:rPr>
+          <w:sz w:val="28"/>
+          <w:szCs w:val="28"/>
+          <w:lang w:bidi="ar-EG"/>
+        </w:rPr>
+        <w:t xml:space="preserve"> </w:t>
+      </w:r>
+      <w:r>
+        <w:rPr>
+          <w:sz w:val="28"/>
+          <w:szCs w:val="28"/>
+          <w:lang w:bidi="ar-EG"/>
+        </w:rPr>
+        <w:t>features to the specific visual domain of German traffic signs.</w:t>
+      </w:r>
+      <w:r>
+        <w:rPr>
+          <w:noProof/>
+        </w:rPr>
+        <w:t xml:space="preserve"> </w:t>
+      </w:r>
+    </w:p>
+    <w:p>
+      <w:pPr>
+        <w:ind w:left="720"/>
+        <w:rPr>
+          <w:sz w:val="28"/>
+          <w:szCs w:val="28"/>
+          <w:lang w:bidi="ar-EG"/>
+        </w:rPr>
+      </w:pPr>
+      <w:r>
+        <w:rPr>
+          <w:sz w:val="28"/>
+          <w:szCs w:val="28"/>
+          <w:lang w:bidi="ar-EG"/>
+        </w:rPr>
+        <w:drawing>
+          <wp:inline distT="0" distB="0" distL="0" distR="0" wp14:anchorId="186B81CB" wp14:editId="2B5DE0DC">
+            <wp:extent cx="4591622" cy="3429000"/>
+            <wp:effectExtent l="0" t="0" r="0" b="0"/>
+            <wp:docPr id="1721826734" name="Picture 1"/>
+            <wp:cNvGraphicFramePr>
+              <a:graphicFrameLocks xmlns:a="http://schemas.openxmlformats.org/drawingml/2006/main" noChangeAspect="1"/>
+            </wp:cNvGraphicFramePr>
+            <a:graphic xmlns:a="http://schemas.openxmlformats.org/drawingml/2006/main">
+              <a:graphicData uri="http://schemas.openxmlformats.org/drawingml/2006/picture">
+                <pic:pic xmlns:pic="http://schemas.openxmlformats.org/drawingml/2006/picture">
+                  <pic:nvPicPr>
+                    <pic:cNvPr id="1721826734" name=""/>
+                    <pic:cNvPicPr/>
+                  </pic:nvPicPr>
+                  <pic:blipFill>
+                    <a:blip r:embed="rId18"/>
+                    <a:stretch>
+                      <a:fillRect/>
+                    </a:stretch>
+                  </pic:blipFill>
+                  <pic:spPr>
+                    <a:xfrm>
+                      <a:off x="0" y="0"/>
+                      <a:ext cx="4596481" cy="3432628"/>
+                    </a:xfrm>
+                    <a:prstGeom prst="rect">
+                      <a:avLst/>
+                    </a:prstGeom>
+                  </pic:spPr>
+                </pic:pic>
+              </a:graphicData>
+            </a:graphic>
+          </wp:inline>
+        </w:drawing>
+      </w:r>
+    </w:p>
+    <w:p>
+      <w:pPr>
+        <w:rPr>
+          <w:sz w:val="28"/>
+          <w:szCs w:val="28"/>
+          <w:lang w:bidi="ar-EG"/>
+        </w:rPr>
+      </w:pPr>
     </w:p>
     <w:p>
       <w:pPr>
@@ -3986,6 +6045,7 @@
           <w:bCs/>
           <w:lang w:bidi="ar-EG"/>
         </w:rPr>
+        <w:lastRenderedPageBreak/>
         <w:t>4.5 Optimizer Benchmarking and Learning Rate Schedulers (trainer_opt.py)</w:t>
       </w:r>
     </w:p>
@@ -4192,6 +6252,97 @@
     </w:p>
     <w:p>
       <w:pPr>
+        <w:rPr>
+          <w:sz w:val="36"/>
+          <w:szCs w:val="28"/>
+          <w:lang w:bidi="ar-EG"/>
+        </w:rPr>
+      </w:pPr>
+      <w:r>
+        <w:rPr>
+          <w:b/>
+          <w:bCs/>
+          <w:sz w:val="36"/>
+          <w:lang w:bidi="ar-EG"/>
+        </w:rPr>
+        <w:t>Optimizer</w:t>
+      </w:r>
+      <w:r>
+        <w:rPr>
+          <w:b/>
+          <w:bCs/>
+          <w:sz w:val="36"/>
+          <w:lang w:bidi="ar-EG"/>
+        </w:rPr>
+        <w:t xml:space="preserve"> Comparison Graphs</w:t>
+      </w:r>
+      <w:r>
+        <w:rPr>
+          <w:b/>
+          <w:bCs/>
+          <w:sz w:val="36"/>
+          <w:lang w:bidi="ar-EG"/>
+        </w:rPr>
+        <w:t>:</w:t>
+      </w:r>
+    </w:p>
+    <w:p>
+      <w:pPr>
+        <w:rPr>
+          <w:b/>
+          <w:bCs/>
+          <w:sz w:val="28"/>
+          <w:szCs w:val="28"/>
+          <w:lang w:bidi="ar-EG"/>
+        </w:rPr>
+      </w:pPr>
+      <w:r>
+        <w:rPr>
+          <w:b/>
+          <w:bCs/>
+          <w:sz w:val="28"/>
+          <w:szCs w:val="28"/>
+          <w:lang w:bidi="ar-EG"/>
+        </w:rPr>
+        <w:drawing>
+          <wp:inline distT="0" distB="0" distL="0" distR="0" wp14:anchorId="38CBC928" wp14:editId="6E59A0FD">
+            <wp:extent cx="6095609" cy="3055620"/>
+            <wp:effectExtent l="0" t="0" r="635" b="0"/>
+            <wp:docPr id="242434962" name="Picture 1"/>
+            <wp:cNvGraphicFramePr>
+              <a:graphicFrameLocks xmlns:a="http://schemas.openxmlformats.org/drawingml/2006/main" noChangeAspect="1"/>
+            </wp:cNvGraphicFramePr>
+            <a:graphic xmlns:a="http://schemas.openxmlformats.org/drawingml/2006/main">
+              <a:graphicData uri="http://schemas.openxmlformats.org/drawingml/2006/picture">
+                <pic:pic xmlns:pic="http://schemas.openxmlformats.org/drawingml/2006/picture">
+                  <pic:nvPicPr>
+                    <pic:cNvPr id="242434962" name=""/>
+                    <pic:cNvPicPr/>
+                  </pic:nvPicPr>
+                  <pic:blipFill>
+                    <a:blip r:embed="rId19"/>
+                    <a:stretch>
+                      <a:fillRect/>
+                    </a:stretch>
+                  </pic:blipFill>
+                  <pic:spPr>
+                    <a:xfrm>
+                      <a:off x="0" y="0"/>
+                      <a:ext cx="6101278" cy="3058462"/>
+                    </a:xfrm>
+                    <a:prstGeom prst="rect">
+                      <a:avLst/>
+                    </a:prstGeom>
+                  </pic:spPr>
+                </pic:pic>
+              </a:graphicData>
+            </a:graphic>
+          </wp:inline>
+        </w:drawing>
+      </w:r>
+    </w:p>
+    <w:p>
+      <w:pPr>
         <w:ind w:left="720"/>
         <w:rPr>
           <w:b/>
@@ -4230,18 +6381,6 @@
       <w:pPr>
         <w:ind w:left="720"/>
         <w:rPr>
-          <w:b/>
-          <w:bCs/>
-          <w:sz w:val="28"/>
-          <w:szCs w:val="28"/>
-          <w:lang w:bidi="ar-EG"/>
-        </w:rPr>
-      </w:pPr>
-    </w:p>
-    <w:p>
-      <w:pPr>
-        <w:ind w:left="720"/>
-        <w:rPr>
           <w:sz w:val="28"/>
           <w:szCs w:val="28"/>
           <w:lang w:bidi="ar-EG"/>
@@ -4259,19 +6398,7 @@
         <w:rPr>
           <w:lang w:bidi="ar-EG"/>
         </w:rPr>
-        <w:t xml:space="preserve">Phase </w:t>
-      </w:r>
-      <w:r>
-        <w:rPr>
-          <w:lang w:bidi="ar-EG"/>
-        </w:rPr>
-        <w:t>3</w:t>
-      </w:r>
-      <w:r>
-        <w:rPr>
-          <w:lang w:bidi="ar-EG"/>
-        </w:rPr>
-        <w:t xml:space="preserve">: </w:t>
+        <w:t xml:space="preserve">Phase 3: </w:t>
       </w:r>
       <w:r>
         <w:rPr>
@@ -4381,15 +6508,7 @@
           <w:bCs/>
           <w:lang w:bidi="ar-EG"/>
         </w:rPr>
-        <w:t>3.</w:t>
-      </w:r>
-      <w:r>
-        <w:rPr>
-          <w:b/>
-          <w:bCs/>
-          <w:lang w:bidi="ar-EG"/>
-        </w:rPr>
-        <w:t>2 Comparative Performance Metrics</w:t>
+        <w:t>3.2 Comparative Performance Metrics</w:t>
       </w:r>
     </w:p>
     <w:tbl>
@@ -4989,23 +7108,7 @@
           <w:bCs/>
           <w:lang w:bidi="ar-EG"/>
         </w:rPr>
-        <w:t>3.</w:t>
-      </w:r>
-      <w:r>
-        <w:rPr>
-          <w:b/>
-          <w:bCs/>
-          <w:lang w:bidi="ar-EG"/>
-        </w:rPr>
-        <w:t>3</w:t>
-      </w:r>
-      <w:r>
-        <w:rPr>
-          <w:b/>
-          <w:bCs/>
-          <w:lang w:bidi="ar-EG"/>
-        </w:rPr>
-        <w:t xml:space="preserve"> Technical Insights</w:t>
+        <w:t>3.3 Technical Insights</w:t>
       </w:r>
     </w:p>
     <w:p>
@@ -5266,15 +7369,7 @@
           <w:bCs/>
           <w:lang w:bidi="ar-EG"/>
         </w:rPr>
-        <w:t>3.</w:t>
-      </w:r>
-      <w:r>
-        <w:rPr>
-          <w:b/>
-          <w:bCs/>
-          <w:lang w:bidi="ar-EG"/>
-        </w:rPr>
-        <w:t>4 Training Dynamics (Plots)</w:t>
+        <w:t>3.4 Training Dynamics (Plots)</w:t>
       </w:r>
     </w:p>
     <w:p>
@@ -5326,7 +7421,7 @@
                     </pic:cNvPicPr>
                   </pic:nvPicPr>
                   <pic:blipFill rotWithShape="1">
-                    <a:blip r:embed="rId8">
+                    <a:blip r:embed="rId20">
                       <a:extLst>
                         <a:ext uri="{28A0092B-C50C-407E-A947-70E740481C1C}">
                           <a14:useLocalDpi xmlns:a14="http://schemas.microsoft.com/office/drawing/2010/main" val="0"/>
@@ -5408,7 +7503,7 @@
                     </pic:cNvPicPr>
                   </pic:nvPicPr>
                   <pic:blipFill rotWithShape="1">
-                    <a:blip r:embed="rId8">
+                    <a:blip r:embed="rId20">
                       <a:extLst>
                         <a:ext uri="{28A0092B-C50C-407E-A947-70E740481C1C}">
                           <a14:useLocalDpi xmlns:a14="http://schemas.microsoft.com/office/drawing/2010/main" val="0"/>
@@ -5551,6 +7646,7 @@
           <w:szCs w:val="28"/>
           <w:lang w:bidi="ar-EG"/>
         </w:rPr>
+        <w:lastRenderedPageBreak/>
         <w:drawing>
           <wp:inline distT="0" distB="0" distL="0" distR="0" wp14:anchorId="6BEABEB5" wp14:editId="68329E4E">
             <wp:extent cx="5128260" cy="1981200"/>
@@ -5569,7 +7665,7 @@
                     </pic:cNvPicPr>
                   </pic:nvPicPr>
                   <pic:blipFill rotWithShape="1">
-                    <a:blip r:embed="rId9">
+                    <a:blip r:embed="rId21">
                       <a:extLst>
                         <a:ext uri="{28A0092B-C50C-407E-A947-70E740481C1C}">
                           <a14:useLocalDpi xmlns:a14="http://schemas.microsoft.com/office/drawing/2010/main" val="0"/>
@@ -5670,7 +7766,7 @@
                     </pic:cNvPicPr>
                   </pic:nvPicPr>
                   <pic:blipFill rotWithShape="1">
-                    <a:blip r:embed="rId9">
+                    <a:blip r:embed="rId21">
                       <a:extLst>
                         <a:ext uri="{28A0092B-C50C-407E-A947-70E740481C1C}">
                           <a14:useLocalDpi xmlns:a14="http://schemas.microsoft.com/office/drawing/2010/main" val="0"/>
@@ -5799,7 +7895,7 @@
                     </pic:cNvPicPr>
                   </pic:nvPicPr>
                   <pic:blipFill rotWithShape="1">
-                    <a:blip r:embed="rId10">
+                    <a:blip r:embed="rId22">
                       <a:extLst>
                         <a:ext uri="{28A0092B-C50C-407E-A947-70E740481C1C}">
                           <a14:useLocalDpi xmlns:a14="http://schemas.microsoft.com/office/drawing/2010/main" val="0"/>
@@ -5900,6 +7996,7 @@
           <w:szCs w:val="28"/>
           <w:lang w:bidi="ar-EG"/>
         </w:rPr>
+        <w:lastRenderedPageBreak/>
         <w:drawing>
           <wp:inline distT="0" distB="0" distL="0" distR="0" wp14:anchorId="45BB9E50" wp14:editId="60F27297">
             <wp:extent cx="5280660" cy="1981200"/>
@@ -5918,7 +8015,7 @@
                     </pic:cNvPicPr>
                   </pic:nvPicPr>
                   <pic:blipFill rotWithShape="1">
-                    <a:blip r:embed="rId10">
+                    <a:blip r:embed="rId22">
                       <a:extLst>
                         <a:ext uri="{28A0092B-C50C-407E-A947-70E740481C1C}">
                           <a14:useLocalDpi xmlns:a14="http://schemas.microsoft.com/office/drawing/2010/main" val="0"/>
@@ -6021,18 +8118,7 @@
           <w:u w:val="single"/>
           <w:lang w:bidi="ar-EG"/>
         </w:rPr>
-        <w:t>LSTM</w:t>
-      </w:r>
-      <w:r>
-        <w:rPr>
-          <w:b/>
-          <w:bCs/>
-          <w:sz w:val="28"/>
-          <w:szCs w:val="28"/>
-          <w:u w:val="single"/>
-          <w:lang w:bidi="ar-EG"/>
-        </w:rPr>
-        <w:t xml:space="preserve"> Model</w:t>
+        <w:t>LSTM Model</w:t>
       </w:r>
     </w:p>
     <w:p>
@@ -6080,7 +8166,7 @@
                     </pic:cNvPicPr>
                   </pic:nvPicPr>
                   <pic:blipFill rotWithShape="1">
-                    <a:blip r:embed="rId11">
+                    <a:blip r:embed="rId23">
                       <a:extLst>
                         <a:ext uri="{28A0092B-C50C-407E-A947-70E740481C1C}">
                           <a14:useLocalDpi xmlns:a14="http://schemas.microsoft.com/office/drawing/2010/main" val="0"/>
@@ -6181,7 +8267,7 @@
                     </pic:cNvPicPr>
                   </pic:nvPicPr>
                   <pic:blipFill rotWithShape="1">
-                    <a:blip r:embed="rId11">
+                    <a:blip r:embed="rId23">
                       <a:extLst>
                         <a:ext uri="{28A0092B-C50C-407E-A947-70E740481C1C}">
                           <a14:useLocalDpi xmlns:a14="http://schemas.microsoft.com/office/drawing/2010/main" val="0"/>
@@ -6262,15 +8348,7 @@
           <w:bCs/>
           <w:lang w:bidi="ar-EG"/>
         </w:rPr>
-        <w:t>3.</w:t>
-      </w:r>
-      <w:r>
-        <w:rPr>
-          <w:b/>
-          <w:bCs/>
-          <w:lang w:bidi="ar-EG"/>
-        </w:rPr>
-        <w:t>5 Discussion</w:t>
+        <w:t>3.5 Discussion</w:t>
       </w:r>
     </w:p>
     <w:p>
@@ -6402,15 +8480,7 @@
           <w:bCs/>
           <w:lang w:bidi="ar-EG"/>
         </w:rPr>
-        <w:t>3.</w:t>
-      </w:r>
-      <w:r>
-        <w:rPr>
-          <w:b/>
-          <w:bCs/>
-          <w:lang w:bidi="ar-EG"/>
-        </w:rPr>
-        <w:t>6 Conclusion</w:t>
+        <w:t>3.6 Conclusion</w:t>
       </w:r>
     </w:p>
     <w:p>
@@ -6446,15 +8516,7 @@
           <w:szCs w:val="28"/>
           <w:lang w:bidi="ar-EG"/>
         </w:rPr>
-        <w:t xml:space="preserve"> architecture is recommended for deployment due to its superior balance of parameter count and classification </w:t>
-      </w:r>
-      <w:r>
-        <w:rPr>
-          <w:sz w:val="28"/>
-          <w:szCs w:val="28"/>
-          <w:lang w:bidi="ar-EG"/>
-        </w:rPr>
-        <w:t>accuracy.</w:t>
+        <w:t xml:space="preserve"> architecture is recommended for deployment due to its superior balance of parameter count and classification accuracy.</w:t>
       </w:r>
       <w:r>
         <w:rPr>
@@ -6492,7 +8554,7 @@
           <w:lang w:bidi="ar-EG"/>
         </w:rPr>
       </w:pPr>
-      <w:hyperlink r:id="rId12" w:history="1">
+      <w:hyperlink r:id="rId24" w:history="1">
         <w:proofErr w:type="spellStart"/>
         <w:r>
           <w:rPr>
@@ -10423,6 +12485,119 @@
     </w:lvl>
   </w:abstractNum>
   <w:abstractNum w:abstractNumId="28" w15:restartNumberingAfterBreak="0">
+    <w:nsid w:val="60A32136"/>
+    <w:multiLevelType w:val="hybridMultilevel"/>
+    <w:tmpl w:val="7486B7C4"/>
+    <w:lvl w:ilvl="0" w:tplc="0C000001">
+      <w:start w:val="1"/>
+      <w:numFmt w:val="bullet"/>
+      <w:lvlText w:val=""/>
+      <w:lvlJc w:val="left"/>
+      <w:pPr>
+        <w:ind w:left="720" w:hanging="360"/>
+      </w:pPr>
+      <w:rPr>
+        <w:rFonts w:ascii="Symbol" w:hAnsi="Symbol" w:hint="default"/>
+      </w:rPr>
+    </w:lvl>
+    <w:lvl w:ilvl="1" w:tplc="0C000003" w:tentative="1">
+      <w:start w:val="1"/>
+      <w:numFmt w:val="bullet"/>
+      <w:lvlText w:val="o"/>
+      <w:lvlJc w:val="left"/>
+      <w:pPr>
+        <w:ind w:left="1440" w:hanging="360"/>
+      </w:pPr>
+      <w:rPr>
+        <w:rFonts w:ascii="Courier New" w:hAnsi="Courier New" w:cs="Courier New" w:hint="default"/>
+      </w:rPr>
+    </w:lvl>
+    <w:lvl w:ilvl="2" w:tplc="0C000005" w:tentative="1">
+      <w:start w:val="1"/>
+      <w:numFmt w:val="bullet"/>
+      <w:lvlText w:val=""/>
+      <w:lvlJc w:val="left"/>
+      <w:pPr>
+        <w:ind w:left="2160" w:hanging="360"/>
+      </w:pPr>
+      <w:rPr>
+        <w:rFonts w:ascii="Wingdings" w:hAnsi="Wingdings" w:hint="default"/>
+      </w:rPr>
+    </w:lvl>
+    <w:lvl w:ilvl="3" w:tplc="0C000001" w:tentative="1">
+      <w:start w:val="1"/>
+      <w:numFmt w:val="bullet"/>
+      <w:lvlText w:val=""/>
+      <w:lvlJc w:val="left"/>
+      <w:pPr>
+        <w:ind w:left="2880" w:hanging="360"/>
+      </w:pPr>
+      <w:rPr>
+        <w:rFonts w:ascii="Symbol" w:hAnsi="Symbol" w:hint="default"/>
+      </w:rPr>
+    </w:lvl>
+    <w:lvl w:ilvl="4" w:tplc="0C000003" w:tentative="1">
+      <w:start w:val="1"/>
+      <w:numFmt w:val="bullet"/>
+      <w:lvlText w:val="o"/>
+      <w:lvlJc w:val="left"/>
+      <w:pPr>
+        <w:ind w:left="3600" w:hanging="360"/>
+      </w:pPr>
+      <w:rPr>
+        <w:rFonts w:ascii="Courier New" w:hAnsi="Courier New" w:cs="Courier New" w:hint="default"/>
+      </w:rPr>
+    </w:lvl>
+    <w:lvl w:ilvl="5" w:tplc="0C000005" w:tentative="1">
+      <w:start w:val="1"/>
+      <w:numFmt w:val="bullet"/>
+      <w:lvlText w:val=""/>
+      <w:lvlJc w:val="left"/>
+      <w:pPr>
+        <w:ind w:left="4320" w:hanging="360"/>
+      </w:pPr>
+      <w:rPr>
+        <w:rFonts w:ascii="Wingdings" w:hAnsi="Wingdings" w:hint="default"/>
+      </w:rPr>
+    </w:lvl>
+    <w:lvl w:ilvl="6" w:tplc="0C000001" w:tentative="1">
+      <w:start w:val="1"/>
+      <w:numFmt w:val="bullet"/>
+      <w:lvlText w:val=""/>
+      <w:lvlJc w:val="left"/>
+      <w:pPr>
+        <w:ind w:left="5040" w:hanging="360"/>
+      </w:pPr>
+      <w:rPr>
+        <w:rFonts w:ascii="Symbol" w:hAnsi="Symbol" w:hint="default"/>
+      </w:rPr>
+    </w:lvl>
+    <w:lvl w:ilvl="7" w:tplc="0C000003" w:tentative="1">
+      <w:start w:val="1"/>
+      <w:numFmt w:val="bullet"/>
+      <w:lvlText w:val="o"/>
+      <w:lvlJc w:val="left"/>
+      <w:pPr>
+        <w:ind w:left="5760" w:hanging="360"/>
+      </w:pPr>
+      <w:rPr>
+        <w:rFonts w:ascii="Courier New" w:hAnsi="Courier New" w:cs="Courier New" w:hint="default"/>
+      </w:rPr>
+    </w:lvl>
+    <w:lvl w:ilvl="8" w:tplc="0C000005" w:tentative="1">
+      <w:start w:val="1"/>
+      <w:numFmt w:val="bullet"/>
+      <w:lvlText w:val=""/>
+      <w:lvlJc w:val="left"/>
+      <w:pPr>
+        <w:ind w:left="6480" w:hanging="360"/>
+      </w:pPr>
+      <w:rPr>
+        <w:rFonts w:ascii="Wingdings" w:hAnsi="Wingdings" w:hint="default"/>
+      </w:rPr>
+    </w:lvl>
+  </w:abstractNum>
+  <w:abstractNum w:abstractNumId="29" w15:restartNumberingAfterBreak="0">
     <w:nsid w:val="61314F64"/>
     <w:multiLevelType w:val="multilevel"/>
     <w:tmpl w:val="F25668BA"/>
@@ -10535,7 +12710,7 @@
       </w:pPr>
     </w:lvl>
   </w:abstractNum>
-  <w:abstractNum w:abstractNumId="29" w15:restartNumberingAfterBreak="0">
+  <w:abstractNum w:abstractNumId="30" w15:restartNumberingAfterBreak="0">
     <w:nsid w:val="62855B3D"/>
     <w:multiLevelType w:val="multilevel"/>
     <w:tmpl w:val="183CFD7A"/>
@@ -10648,7 +12823,7 @@
       </w:pPr>
     </w:lvl>
   </w:abstractNum>
-  <w:abstractNum w:abstractNumId="30" w15:restartNumberingAfterBreak="0">
+  <w:abstractNum w:abstractNumId="31" w15:restartNumberingAfterBreak="0">
     <w:nsid w:val="6CCF1534"/>
     <w:multiLevelType w:val="multilevel"/>
     <w:tmpl w:val="4282DE8A"/>
@@ -10797,7 +12972,7 @@
       </w:rPr>
     </w:lvl>
   </w:abstractNum>
-  <w:abstractNum w:abstractNumId="31" w15:restartNumberingAfterBreak="0">
+  <w:abstractNum w:abstractNumId="32" w15:restartNumberingAfterBreak="0">
     <w:nsid w:val="71C43D4F"/>
     <w:multiLevelType w:val="hybridMultilevel"/>
     <w:tmpl w:val="6A583A34"/>
@@ -10912,7 +13087,7 @@
       </w:rPr>
     </w:lvl>
   </w:abstractNum>
-  <w:abstractNum w:abstractNumId="32" w15:restartNumberingAfterBreak="0">
+  <w:abstractNum w:abstractNumId="33" w15:restartNumberingAfterBreak="0">
     <w:nsid w:val="74105902"/>
     <w:multiLevelType w:val="multilevel"/>
     <w:tmpl w:val="D534DDDA"/>
@@ -11025,7 +13200,7 @@
       </w:pPr>
     </w:lvl>
   </w:abstractNum>
-  <w:abstractNum w:abstractNumId="33" w15:restartNumberingAfterBreak="0">
+  <w:abstractNum w:abstractNumId="34" w15:restartNumberingAfterBreak="0">
     <w:nsid w:val="7639380D"/>
     <w:multiLevelType w:val="multilevel"/>
     <w:tmpl w:val="0472E0CC"/>
@@ -11174,7 +13349,7 @@
       </w:rPr>
     </w:lvl>
   </w:abstractNum>
-  <w:abstractNum w:abstractNumId="34" w15:restartNumberingAfterBreak="0">
+  <w:abstractNum w:abstractNumId="35" w15:restartNumberingAfterBreak="0">
     <w:nsid w:val="7D812348"/>
     <w:multiLevelType w:val="multilevel"/>
     <w:tmpl w:val="5F36FC94"/>
@@ -11325,7 +13500,7 @@
     <w:abstractNumId w:val="19"/>
   </w:num>
   <w:num w:numId="2" w16cid:durableId="1153453207">
-    <w:abstractNumId w:val="31"/>
+    <w:abstractNumId w:val="32"/>
   </w:num>
   <w:num w:numId="3" w16cid:durableId="1832797068">
     <w:abstractNumId w:val="2"/>
@@ -11392,7 +13567,7 @@
     </w:lvlOverride>
   </w:num>
   <w:num w:numId="13" w16cid:durableId="993072558">
-    <w:abstractNumId w:val="28"/>
+    <w:abstractNumId w:val="29"/>
     <w:lvlOverride w:ilvl="0">
       <w:lvl w:ilvl="0">
         <w:numFmt w:val="decimal"/>
@@ -11402,7 +13577,7 @@
     </w:lvlOverride>
   </w:num>
   <w:num w:numId="14" w16cid:durableId="484278067">
-    <w:abstractNumId w:val="28"/>
+    <w:abstractNumId w:val="29"/>
     <w:lvlOverride w:ilvl="0">
       <w:lvl w:ilvl="0">
         <w:numFmt w:val="decimal"/>
@@ -11421,7 +13596,7 @@
     <w:abstractNumId w:val="21"/>
   </w:num>
   <w:num w:numId="18" w16cid:durableId="2005664664">
-    <w:abstractNumId w:val="29"/>
+    <w:abstractNumId w:val="30"/>
   </w:num>
   <w:num w:numId="19" w16cid:durableId="2128966963">
     <w:abstractNumId w:val="8"/>
@@ -11445,7 +13620,7 @@
     <w:abstractNumId w:val="22"/>
   </w:num>
   <w:num w:numId="26" w16cid:durableId="912004958">
-    <w:abstractNumId w:val="33"/>
+    <w:abstractNumId w:val="34"/>
     <w:lvlOverride w:ilvl="0">
       <w:lvl w:ilvl="0">
         <w:numFmt w:val="bullet"/>
@@ -11465,7 +13640,7 @@
     </w:lvlOverride>
   </w:num>
   <w:num w:numId="27" w16cid:durableId="921523088">
-    <w:abstractNumId w:val="33"/>
+    <w:abstractNumId w:val="34"/>
     <w:lvlOverride w:ilvl="0">
       <w:lvl w:ilvl="0">
         <w:numFmt w:val="bullet"/>
@@ -11488,7 +13663,7 @@
     <w:abstractNumId w:val="4"/>
   </w:num>
   <w:num w:numId="29" w16cid:durableId="1433010617">
-    <w:abstractNumId w:val="32"/>
+    <w:abstractNumId w:val="33"/>
   </w:num>
   <w:num w:numId="30" w16cid:durableId="2000957432">
     <w:abstractNumId w:val="13"/>
@@ -11503,19 +13678,22 @@
     <w:abstractNumId w:val="23"/>
   </w:num>
   <w:num w:numId="34" w16cid:durableId="1742829635">
-    <w:abstractNumId w:val="30"/>
+    <w:abstractNumId w:val="31"/>
   </w:num>
   <w:num w:numId="35" w16cid:durableId="1909069890">
     <w:abstractNumId w:val="11"/>
   </w:num>
   <w:num w:numId="36" w16cid:durableId="1810440523">
-    <w:abstractNumId w:val="34"/>
+    <w:abstractNumId w:val="35"/>
   </w:num>
   <w:num w:numId="37" w16cid:durableId="1638534901">
     <w:abstractNumId w:val="24"/>
   </w:num>
   <w:num w:numId="38" w16cid:durableId="1009337303">
     <w:abstractNumId w:val="20"/>
+  </w:num>
+  <w:num w:numId="39" w16cid:durableId="1762682325">
+    <w:abstractNumId w:val="28"/>
   </w:num>
 </w:numbering>
 </file>

</xml_diff>